<commit_message>
Student A report: add Problem Formulation section, set Arial font
- New Section 1 (problem / why Bayesian networks / advantages) prepended;
  subsequent sections renumbered
- md_to_docx converter now applies Arial to all styles and runs
  (code spans keep Consolas)

Co-Authored-By: Claude Fable 5 <noreply@anthropic.com>
Claude-Session: https://claude.ai/code/session_01TXeBuaami2Sc9P1Aii2M7B
</commit_message>
<xml_diff>
--- a/GWP1_StudentA/GWP1_StudentA_Report.docx
+++ b/GWP1_StudentA/GWP1_StudentA_Report.docx
@@ -7,6 +7,9 @@
         <w:pStyle w:val="Heading1"/>
       </w:pPr>
       <w:r>
+        <w:rPr>
+          <w:rFonts w:ascii="Arial" w:hAnsi="Arial"/>
+        </w:rPr>
         <w:t>GWP1 — Student A Contribution</w:t>
       </w:r>
     </w:p>
@@ -15,6 +18,9 @@
         <w:pStyle w:val="Heading3"/>
       </w:pPr>
       <w:r>
+        <w:rPr>
+          <w:rFonts w:ascii="Arial" w:hAnsi="Arial"/>
+        </w:rPr>
         <w:t>Macroeconomic and Geopolitical Variables, Outlier Screening, and Distributional Analysis</w:t>
       </w:r>
     </w:p>
@@ -36,6 +42,7 @@
           <w:p>
             <w:r>
               <w:rPr>
+                <w:rFonts w:ascii="Arial" w:hAnsi="Arial"/>
                 <w:b/>
               </w:rPr>
               <w:t>Field</w:t>
@@ -49,6 +56,7 @@
           <w:p>
             <w:r>
               <w:rPr>
+                <w:rFonts w:ascii="Arial" w:hAnsi="Arial"/>
                 <w:b/>
               </w:rPr>
               <w:t>Entry</w:t>
@@ -64,6 +72,7 @@
           <w:p>
             <w:r>
               <w:rPr>
+                <w:rFonts w:ascii="Arial" w:hAnsi="Arial"/>
                 <w:b/>
               </w:rPr>
               <w:t>Course</w:t>
@@ -76,6 +85,9 @@
           </w:tcPr>
           <w:p>
             <w:r>
+              <w:rPr>
+                <w:rFonts w:ascii="Arial" w:hAnsi="Arial"/>
+              </w:rPr>
               <w:t>MScFE 660 Risk Management</w:t>
             </w:r>
           </w:p>
@@ -89,6 +101,7 @@
           <w:p>
             <w:r>
               <w:rPr>
+                <w:rFonts w:ascii="Arial" w:hAnsi="Arial"/>
                 <w:b/>
               </w:rPr>
               <w:t>Assignment</w:t>
@@ -101,6 +114,9 @@
           </w:tcPr>
           <w:p>
             <w:r>
+              <w:rPr>
+                <w:rFonts w:ascii="Arial" w:hAnsi="Arial"/>
+              </w:rPr>
               <w:t>Group Work Project 1 — individual contribution</w:t>
             </w:r>
           </w:p>
@@ -114,6 +130,7 @@
           <w:p>
             <w:r>
               <w:rPr>
+                <w:rFonts w:ascii="Arial" w:hAnsi="Arial"/>
                 <w:b/>
               </w:rPr>
               <w:t>Role</w:t>
@@ -126,6 +143,9 @@
           </w:tcPr>
           <w:p>
             <w:r>
+              <w:rPr>
+                <w:rFonts w:ascii="Arial" w:hAnsi="Arial"/>
+              </w:rPr>
               <w:t>Student A: macroeconomic / geopolitical specialist</w:t>
             </w:r>
           </w:p>
@@ -139,6 +159,7 @@
           <w:p>
             <w:r>
               <w:rPr>
+                <w:rFonts w:ascii="Arial" w:hAnsi="Arial"/>
                 <w:b/>
               </w:rPr>
               <w:t>Prepared by</w:t>
@@ -151,6 +172,9 @@
           </w:tcPr>
           <w:p>
             <w:r>
+              <w:rPr>
+                <w:rFonts w:ascii="Arial" w:hAnsi="Arial"/>
+              </w:rPr>
               <w:t>Seungeun Park</w:t>
             </w:r>
           </w:p>
@@ -164,6 +188,7 @@
           <w:p>
             <w:r>
               <w:rPr>
+                <w:rFonts w:ascii="Arial" w:hAnsi="Arial"/>
                 <w:b/>
               </w:rPr>
               <w:t>Core sample</w:t>
@@ -176,6 +201,9 @@
           </w:tcPr>
           <w:p>
             <w:r>
+              <w:rPr>
+                <w:rFonts w:ascii="Arial" w:hAnsi="Arial"/>
+              </w:rPr>
               <w:t>2006-02 to 2025-12, 239 monthly observations</w:t>
             </w:r>
           </w:p>
@@ -189,6 +217,7 @@
           <w:p>
             <w:r>
               <w:rPr>
+                <w:rFonts w:ascii="Arial" w:hAnsi="Arial"/>
                 <w:b/>
               </w:rPr>
               <w:t>Companion file</w:t>
@@ -209,6 +238,9 @@
               <w:t>GWP1_StudentA_Notebook.ipynb</w:t>
             </w:r>
             <w:r>
+              <w:rPr>
+                <w:rFonts w:ascii="Arial" w:hAnsi="Arial"/>
+              </w:rPr>
               <w:t xml:space="preserve"> (executed; HTML copy included)</w:t>
             </w:r>
           </w:p>
@@ -221,6 +253,9 @@
         <w:jc w:val="center"/>
       </w:pPr>
       <w:r>
+        <w:rPr>
+          <w:rFonts w:ascii="Arial" w:hAnsi="Arial"/>
+        </w:rPr>
         <w:t>____________________________________________________________</w:t>
       </w:r>
     </w:p>
@@ -229,61 +264,293 @@
         <w:pStyle w:val="Heading2"/>
       </w:pPr>
       <w:r>
-        <w:t>1. Role and scope</w:t>
+        <w:rPr>
+          <w:rFonts w:ascii="Arial" w:hAnsi="Arial"/>
+        </w:rPr>
+        <w:t>1. Problem Formulation</w:t>
+      </w:r>
+    </w:p>
+    <w:p>
+      <w:pPr>
+        <w:pStyle w:val="Heading3"/>
+      </w:pPr>
+      <w:r>
+        <w:rPr>
+          <w:rFonts w:ascii="Arial" w:hAnsi="Arial"/>
+        </w:rPr>
+        <w:t>1.1 Problem addressed by the thesis</w:t>
       </w:r>
     </w:p>
     <w:p>
       <w:r>
+        <w:rPr>
+          <w:rFonts w:ascii="Arial" w:hAnsi="Arial"/>
+        </w:rPr>
+        <w:t>The problem is to forecast crude oil price states in a setting where several</w:t>
+      </w:r>
+    </w:p>
+    <w:p>
+      <w:r>
+        <w:rPr>
+          <w:rFonts w:ascii="Arial" w:hAnsi="Arial"/>
+        </w:rPr>
+        <w:t>drivers move together and where the relationships may change during stress</w:t>
+      </w:r>
+    </w:p>
+    <w:p>
+      <w:r>
+        <w:rPr>
+          <w:rFonts w:ascii="Arial" w:hAnsi="Arial"/>
+        </w:rPr>
+        <w:t>periods. A plain one-variable price model is too narrow for this task. Oil</w:t>
+      </w:r>
+    </w:p>
+    <w:p>
+      <w:r>
+        <w:rPr>
+          <w:rFonts w:ascii="Arial" w:hAnsi="Arial"/>
+        </w:rPr>
+        <w:t>prices respond to market benchmarks, currency conditions, risk appetite,</w:t>
+      </w:r>
+    </w:p>
+    <w:p>
+      <w:r>
+        <w:rPr>
+          <w:rFonts w:ascii="Arial" w:hAnsi="Arial"/>
+        </w:rPr>
+        <w:t>inventories, and geopolitical risk. The purpose of this GWP1 report is</w:t>
+      </w:r>
+    </w:p>
+    <w:p>
+      <w:r>
+        <w:rPr>
+          <w:rFonts w:ascii="Arial" w:hAnsi="Arial"/>
+        </w:rPr>
+        <w:t>therefore not to claim a final causal model, but to prepare a clean variable</w:t>
+      </w:r>
+    </w:p>
+    <w:p>
+      <w:r>
+        <w:rPr>
+          <w:rFonts w:ascii="Arial" w:hAnsi="Arial"/>
+        </w:rPr>
+        <w:t>panel for Bayesian-network development.</w:t>
+      </w:r>
+    </w:p>
+    <w:p>
+      <w:pPr>
+        <w:pStyle w:val="Heading3"/>
+      </w:pPr>
+      <w:r>
+        <w:rPr>
+          <w:rFonts w:ascii="Arial" w:hAnsi="Arial"/>
+        </w:rPr>
+        <w:t>1.2 Why Bayesian networks fit the problem</w:t>
+      </w:r>
+    </w:p>
+    <w:p>
+      <w:r>
+        <w:rPr>
+          <w:rFonts w:ascii="Arial" w:hAnsi="Arial"/>
+        </w:rPr>
+        <w:t>Bayesian networks are useful because they express multivariate dependence</w:t>
+      </w:r>
+    </w:p>
+    <w:p>
+      <w:r>
+        <w:rPr>
+          <w:rFonts w:ascii="Arial" w:hAnsi="Arial"/>
+        </w:rPr>
+        <w:t>through nodes, directed edges, and conditional probability tables. That</w:t>
+      </w:r>
+    </w:p>
+    <w:p>
+      <w:r>
+        <w:rPr>
+          <w:rFonts w:ascii="Arial" w:hAnsi="Arial"/>
+        </w:rPr>
+        <w:t>structure is easier to interpret than a black-box regression when the research</w:t>
+      </w:r>
+    </w:p>
+    <w:p>
+      <w:r>
+        <w:rPr>
+          <w:rFonts w:ascii="Arial" w:hAnsi="Arial"/>
+        </w:rPr>
+        <w:t>question is about how oil-price states are associated with candidate drivers.</w:t>
+      </w:r>
+    </w:p>
+    <w:p>
+      <w:r>
+        <w:rPr>
+          <w:rFonts w:ascii="Arial" w:hAnsi="Arial"/>
+        </w:rPr>
+        <w:t>The network also allows future scenario questions, such as how the probability</w:t>
+      </w:r>
+    </w:p>
+    <w:p>
+      <w:r>
+        <w:rPr>
+          <w:rFonts w:ascii="Arial" w:hAnsi="Arial"/>
+        </w:rPr>
+        <w:t>of a WTI down month changes when the dollar strengthens and geopolitical risk</w:t>
+      </w:r>
+    </w:p>
+    <w:p>
+      <w:r>
+        <w:rPr>
+          <w:rFonts w:ascii="Arial" w:hAnsi="Arial"/>
+        </w:rPr>
+        <w:t>is high.</w:t>
+      </w:r>
+    </w:p>
+    <w:p>
+      <w:pPr>
+        <w:pStyle w:val="Heading3"/>
+      </w:pPr>
+      <w:r>
+        <w:rPr>
+          <w:rFonts w:ascii="Arial" w:hAnsi="Arial"/>
+        </w:rPr>
+        <w:t>1.3 Advantages of the methodology</w:t>
+      </w:r>
+    </w:p>
+    <w:p>
+      <w:r>
+        <w:rPr>
+          <w:rFonts w:ascii="Arial" w:hAnsi="Arial"/>
+        </w:rPr>
+        <w:t>The main advantage is that the method can combine data evidence with domain</w:t>
+      </w:r>
+    </w:p>
+    <w:p>
+      <w:r>
+        <w:rPr>
+          <w:rFonts w:ascii="Arial" w:hAnsi="Arial"/>
+        </w:rPr>
+        <w:t>restrictions. In this report, same-month dependence statistics are treated as</w:t>
+      </w:r>
+    </w:p>
+    <w:p>
+      <w:r>
+        <w:rPr>
+          <w:rFonts w:ascii="Arial" w:hAnsi="Arial"/>
+        </w:rPr>
+        <w:t>screening evidence. Predictive timing is left for later model validation. This</w:t>
+      </w:r>
+    </w:p>
+    <w:p>
+      <w:r>
+        <w:rPr>
+          <w:rFonts w:ascii="Arial" w:hAnsi="Arial"/>
+        </w:rPr>
+        <w:t>avoids overstating the early-stage evidence while still giving GWP2 a coherent</w:t>
+      </w:r>
+    </w:p>
+    <w:p>
+      <w:r>
+        <w:rPr>
+          <w:rFonts w:ascii="Arial" w:hAnsi="Arial"/>
+        </w:rPr>
+        <w:t>set of candidate parents for WTI return state.</w:t>
+      </w:r>
+    </w:p>
+    <w:p>
+      <w:pPr>
+        <w:pStyle w:val="Heading2"/>
+      </w:pPr>
+      <w:r>
+        <w:rPr>
+          <w:rFonts w:ascii="Arial" w:hAnsi="Arial"/>
+        </w:rPr>
+        <w:t>2. Role and scope</w:t>
+      </w:r>
+    </w:p>
+    <w:p>
+      <w:r>
+        <w:rPr>
+          <w:rFonts w:ascii="Arial" w:hAnsi="Arial"/>
+        </w:rPr>
         <w:t>This document covers the four tasks assigned to Student A in the group's</w:t>
       </w:r>
     </w:p>
     <w:p>
       <w:r>
+        <w:rPr>
+          <w:rFonts w:ascii="Arial" w:hAnsi="Arial"/>
+        </w:rPr>
         <w:t>crude-oil PGM project. Under Step 3, Student A identifies, imports, structures</w:t>
       </w:r>
     </w:p>
     <w:p>
       <w:r>
+        <w:rPr>
+          <w:rFonts w:ascii="Arial" w:hAnsi="Arial"/>
+        </w:rPr>
         <w:t>and graphs the macroeconomic and geopolitical variables. Under Step 5, Student A</w:t>
       </w:r>
     </w:p>
     <w:p>
       <w:r>
+        <w:rPr>
+          <w:rFonts w:ascii="Arial" w:hAnsi="Arial"/>
+        </w:rPr>
         <w:t>runs the extreme-outlier part of the cleaning protocol on *all* of the group's</w:t>
       </w:r>
     </w:p>
     <w:p>
       <w:r>
+        <w:rPr>
+          <w:rFonts w:ascii="Arial" w:hAnsi="Arial"/>
+        </w:rPr>
         <w:t>series, so that every dataset passes through this lens once. Under Step 7,</w:t>
       </w:r>
     </w:p>
     <w:p>
       <w:r>
+        <w:rPr>
+          <w:rFonts w:ascii="Arial" w:hAnsi="Arial"/>
+        </w:rPr>
         <w:t>Student A produces the distributional plots, again for all datasets. Under</w:t>
       </w:r>
     </w:p>
     <w:p>
       <w:r>
+        <w:rPr>
+          <w:rFonts w:ascii="Arial" w:hAnsi="Arial"/>
+        </w:rPr>
         <w:t>Step 9, Student A summarises probabilistic graphical models and the distinction</w:t>
       </w:r>
     </w:p>
     <w:p>
       <w:r>
+        <w:rPr>
+          <w:rFonts w:ascii="Arial" w:hAnsi="Arial"/>
+        </w:rPr>
         <w:t>between belief networks and Markov networks. The group-level steps — problem</w:t>
       </w:r>
     </w:p>
     <w:p>
       <w:r>
+        <w:rPr>
+          <w:rFonts w:ascii="Arial" w:hAnsi="Arial"/>
+        </w:rPr>
         <w:t>formulation, the combined data dictionary, the sterilized dataset, the Step 8</w:t>
       </w:r>
     </w:p>
     <w:p>
       <w:r>
+        <w:rPr>
+          <w:rFonts w:ascii="Arial" w:hAnsi="Arial"/>
+        </w:rPr>
         <w:t>answers and the inferred-causality pseudocode — are written jointly and are not</w:t>
       </w:r>
     </w:p>
     <w:p>
       <w:r>
+        <w:rPr>
+          <w:rFonts w:ascii="Arial" w:hAnsi="Arial"/>
+        </w:rPr>
         <w:t>repeated here.</w:t>
       </w:r>
     </w:p>
@@ -292,22 +559,32 @@
         <w:pStyle w:val="Heading2"/>
       </w:pPr>
       <w:r>
-        <w:t>2. Step 3 — Macroeconomic and geopolitical variables</w:t>
+        <w:rPr>
+          <w:rFonts w:ascii="Arial" w:hAnsi="Arial"/>
+        </w:rPr>
+        <w:t>3. Step 3 — Macroeconomic and geopolitical variables</w:t>
       </w:r>
     </w:p>
     <w:p>
       <w:r>
+        <w:rPr>
+          <w:rFonts w:ascii="Arial" w:hAnsi="Arial"/>
+        </w:rPr>
         <w:t>Two series in the group panel fall under Student A's specialism.</w:t>
       </w:r>
     </w:p>
     <w:p>
       <w:r>
         <w:rPr>
+          <w:rFonts w:ascii="Arial" w:hAnsi="Arial"/>
           <w:b/>
         </w:rPr>
         <w:t>Broad U.S. dollar index</w:t>
       </w:r>
       <w:r>
+        <w:rPr>
+          <w:rFonts w:ascii="Arial" w:hAnsi="Arial"/>
+        </w:rPr>
         <w:t xml:space="preserve"> (FRED </w:t>
       </w:r>
       <w:r>
@@ -319,121 +596,189 @@
         <w:t>TWEXBGSMTH</w:t>
       </w:r>
       <w:r>
+        <w:rPr>
+          <w:rFonts w:ascii="Arial" w:hAnsi="Arial"/>
+        </w:rPr>
         <w:t>; macroeconomic). Crude oil is</w:t>
       </w:r>
     </w:p>
     <w:p>
       <w:r>
+        <w:rPr>
+          <w:rFonts w:ascii="Arial" w:hAnsi="Arial"/>
+        </w:rPr>
         <w:t>priced in dollars, so a stronger dollar mechanically pressures the barrel for</w:t>
       </w:r>
     </w:p>
     <w:p>
       <w:r>
+        <w:rPr>
+          <w:rFonts w:ascii="Arial" w:hAnsi="Arial"/>
+        </w:rPr>
         <w:t>non-dollar buyers. The raw index begins in January 2006, and that start date is</w:t>
       </w:r>
     </w:p>
     <w:p>
       <w:r>
+        <w:rPr>
+          <w:rFonts w:ascii="Arial" w:hAnsi="Arial"/>
+        </w:rPr>
         <w:t>what pins the group's core sample to 2006-02 onward — a trade-off the group</w:t>
       </w:r>
     </w:p>
     <w:p>
       <w:r>
+        <w:rPr>
+          <w:rFonts w:ascii="Arial" w:hAnsi="Arial"/>
+        </w:rPr>
         <w:t>accepted because the currency channel is worth more to the model than the</w:t>
       </w:r>
     </w:p>
     <w:p>
       <w:r>
+        <w:rPr>
+          <w:rFonts w:ascii="Arial" w:hAnsi="Arial"/>
+        </w:rPr>
         <w:t>pre-2006 oil history it costs.</w:t>
       </w:r>
     </w:p>
     <w:p>
       <w:r>
         <w:rPr>
+          <w:rFonts w:ascii="Arial" w:hAnsi="Arial"/>
           <w:b/>
         </w:rPr>
         <w:t>Geopolitical Risk index</w:t>
       </w:r>
       <w:r>
+        <w:rPr>
+          <w:rFonts w:ascii="Arial" w:hAnsi="Arial"/>
+        </w:rPr>
         <w:t xml:space="preserve"> (Caldara and Iacoviello; geopolitical). A news-based</w:t>
       </w:r>
     </w:p>
     <w:p>
       <w:r>
+        <w:rPr>
+          <w:rFonts w:ascii="Arial" w:hAnsi="Arial"/>
+        </w:rPr>
         <w:t>count of war, terror and sanction coverage, available from 1985. Its full</w:t>
       </w:r>
     </w:p>
     <w:p>
       <w:r>
+        <w:rPr>
+          <w:rFonts w:ascii="Arial" w:hAnsi="Arial"/>
+        </w:rPr>
         <w:t>history (Figure A1b) shows the character of the series: it does not trend, it</w:t>
       </w:r>
     </w:p>
     <w:p>
       <w:r>
+        <w:rPr>
+          <w:rFonts w:ascii="Arial" w:hAnsi="Arial"/>
+        </w:rPr>
         <w:t>spikes. The Gulf War, 9/11, the Iraq invasion and the 2022 invasion of Ukraine</w:t>
       </w:r>
     </w:p>
     <w:p>
       <w:r>
+        <w:rPr>
+          <w:rFonts w:ascii="Arial" w:hAnsi="Arial"/>
+        </w:rPr>
         <w:t>all appear as sharp jumps followed by decay. In the core sample the largest</w:t>
       </w:r>
     </w:p>
     <w:p>
       <w:r>
+        <w:rPr>
+          <w:rFonts w:ascii="Arial" w:hAnsi="Arial"/>
+        </w:rPr>
         <w:t>monthly changes land on February–April 2022 and on October 2023.</w:t>
       </w:r>
     </w:p>
     <w:p>
       <w:r>
+        <w:rPr>
+          <w:rFonts w:ascii="Arial" w:hAnsi="Arial"/>
+        </w:rPr>
         <w:t>Both series were imported from their raw files, aligned to the group's monthly</w:t>
       </w:r>
     </w:p>
     <w:p>
       <w:r>
+        <w:rPr>
+          <w:rFonts w:ascii="Arial" w:hAnsi="Arial"/>
+        </w:rPr>
         <w:t>grid, and transformed — the dollar to monthly log-returns, GPR to level and</w:t>
       </w:r>
     </w:p>
     <w:p>
       <w:r>
+        <w:rPr>
+          <w:rFonts w:ascii="Arial" w:hAnsi="Arial"/>
+        </w:rPr>
         <w:t>monthly change (Figures A1–A2). Two structuring observations matter for the</w:t>
       </w:r>
     </w:p>
     <w:p>
       <w:r>
+        <w:rPr>
+          <w:rFonts w:ascii="Arial" w:hAnsi="Arial"/>
+        </w:rPr>
         <w:t>model stage. First, the dollar return shows the expected inverse relationship</w:t>
       </w:r>
     </w:p>
     <w:p>
       <w:r>
+        <w:rPr>
+          <w:rFonts w:ascii="Arial" w:hAnsi="Arial"/>
+        </w:rPr>
         <w:t xml:space="preserve">with WTI returns, about </w:t>
       </w:r>
       <w:r>
         <w:rPr>
+          <w:rFonts w:ascii="Arial" w:hAnsi="Arial"/>
           <w:b/>
         </w:rPr>
         <w:t>−0.44</w:t>
       </w:r>
       <w:r>
+        <w:rPr>
+          <w:rFonts w:ascii="Arial" w:hAnsi="Arial"/>
+        </w:rPr>
         <w:t xml:space="preserve"> in the core sample, the strongest single</w:t>
       </w:r>
     </w:p>
     <w:p>
       <w:r>
+        <w:rPr>
+          <w:rFonts w:ascii="Arial" w:hAnsi="Arial"/>
+        </w:rPr>
         <w:t>non-oil link in the panel. Second, GPR's spike-and-decay shape means it carries</w:t>
       </w:r>
     </w:p>
     <w:p>
       <w:r>
+        <w:rPr>
+          <w:rFonts w:ascii="Arial" w:hAnsi="Arial"/>
+        </w:rPr>
         <w:t>information as a *state* (calm / elevated / extreme) rather than as a smooth</w:t>
       </w:r>
     </w:p>
     <w:p>
       <w:r>
+        <w:rPr>
+          <w:rFonts w:ascii="Arial" w:hAnsi="Arial"/>
+        </w:rPr>
         <w:t>level, which supports the group's decision to discretize every driver before</w:t>
       </w:r>
     </w:p>
     <w:p>
       <w:r>
+        <w:rPr>
+          <w:rFonts w:ascii="Arial" w:hAnsi="Arial"/>
+        </w:rPr>
         <w:t>the Bayesian-network stage.</w:t>
       </w:r>
     </w:p>
@@ -442,119 +787,178 @@
         <w:pStyle w:val="Heading2"/>
       </w:pPr>
       <w:r>
-        <w:t>3. Step 5 — Extreme-outlier screening (all series)</w:t>
+        <w:rPr>
+          <w:rFonts w:ascii="Arial" w:hAnsi="Arial"/>
+        </w:rPr>
+        <w:t>4. Step 5 — Extreme-outlier screening (all series)</w:t>
       </w:r>
     </w:p>
     <w:p>
       <w:r>
+        <w:rPr>
+          <w:rFonts w:ascii="Arial" w:hAnsi="Arial"/>
+        </w:rPr>
         <w:t>Student A's cleaning responsibility is the extreme-outlier check, applied to</w:t>
       </w:r>
     </w:p>
     <w:p>
       <w:r>
+        <w:rPr>
+          <w:rFonts w:ascii="Arial" w:hAnsi="Arial"/>
+        </w:rPr>
         <w:t>every transformed series in the panel: WTI and Brent returns, the dollar</w:t>
       </w:r>
     </w:p>
     <w:p>
       <w:r>
+        <w:rPr>
+          <w:rFonts w:ascii="Arial" w:hAnsi="Arial"/>
+        </w:rPr>
         <w:t>return, the VIX change, the inventory change and the GPR change.</w:t>
       </w:r>
     </w:p>
     <w:p>
       <w:r>
         <w:rPr>
+          <w:rFonts w:ascii="Arial" w:hAnsi="Arial"/>
           <w:b/>
         </w:rPr>
         <w:t>Method.</w:t>
       </w:r>
       <w:r>
+        <w:rPr>
+          <w:rFonts w:ascii="Arial" w:hAnsi="Arial"/>
+        </w:rPr>
         <w:t xml:space="preserve"> Each observation receives a </w:t>
       </w:r>
       <w:r>
         <w:rPr>
+          <w:rFonts w:ascii="Arial" w:hAnsi="Arial"/>
           <w:b/>
         </w:rPr>
         <w:t>modified z-score</w:t>
       </w:r>
       <w:r>
+        <w:rPr>
+          <w:rFonts w:ascii="Arial" w:hAnsi="Arial"/>
+        </w:rPr>
         <w:t xml:space="preserve"> built from the</w:t>
       </w:r>
     </w:p>
     <w:p>
       <w:r>
+        <w:rPr>
+          <w:rFonts w:ascii="Arial" w:hAnsi="Arial"/>
+        </w:rPr>
         <w:t>median and the median absolute deviation (MAD) rather than the mean and</w:t>
       </w:r>
     </w:p>
     <w:p>
       <w:r>
+        <w:rPr>
+          <w:rFonts w:ascii="Arial" w:hAnsi="Arial"/>
+        </w:rPr>
         <w:t>standard deviation. The reason is practical: the mean and standard deviation</w:t>
       </w:r>
     </w:p>
     <w:p>
       <w:r>
+        <w:rPr>
+          <w:rFonts w:ascii="Arial" w:hAnsi="Arial"/>
+        </w:rPr>
         <w:t>are themselves distorted by the outliers the screen is looking for, so a plain</w:t>
       </w:r>
     </w:p>
     <w:p>
       <w:r>
+        <w:rPr>
+          <w:rFonts w:ascii="Arial" w:hAnsi="Arial"/>
+        </w:rPr>
         <w:t>z-score under-flags exactly when it matters. A month is flagged when the</w:t>
       </w:r>
     </w:p>
     <w:p>
       <w:r>
+        <w:rPr>
+          <w:rFonts w:ascii="Arial" w:hAnsi="Arial"/>
+        </w:rPr>
         <w:t>absolute modified z-score exceeds 5.</w:t>
       </w:r>
     </w:p>
     <w:p>
       <w:r>
         <w:rPr>
+          <w:rFonts w:ascii="Arial" w:hAnsi="Arial"/>
           <w:b/>
         </w:rPr>
         <w:t>Rule.</w:t>
       </w:r>
       <w:r>
+        <w:rPr>
+          <w:rFonts w:ascii="Arial" w:hAnsi="Arial"/>
+        </w:rPr>
         <w:t xml:space="preserve"> Flagged months are reviewed, not deleted. In oil data the extreme</w:t>
       </w:r>
     </w:p>
     <w:p>
       <w:r>
+        <w:rPr>
+          <w:rFonts w:ascii="Arial" w:hAnsi="Arial"/>
+        </w:rPr>
         <w:t>observations are usually the point — deleting 2020 would remove the single most</w:t>
       </w:r>
     </w:p>
     <w:p>
       <w:r>
+        <w:rPr>
+          <w:rFonts w:ascii="Arial" w:hAnsi="Arial"/>
+        </w:rPr>
         <w:t>informative stress episode in the sample.</w:t>
       </w:r>
     </w:p>
     <w:p>
       <w:r>
         <w:rPr>
+          <w:rFonts w:ascii="Arial" w:hAnsi="Arial"/>
           <w:b/>
         </w:rPr>
         <w:t>Findings.</w:t>
       </w:r>
       <w:r>
+        <w:rPr>
+          <w:rFonts w:ascii="Arial" w:hAnsi="Arial"/>
+        </w:rPr>
         <w:t xml:space="preserve"> The screen flags 15 observations across the six series</w:t>
       </w:r>
     </w:p>
     <w:p>
       <w:r>
+        <w:rPr>
+          <w:rFonts w:ascii="Arial" w:hAnsi="Arial"/>
+        </w:rPr>
         <w:t>(Table A1). Every one of them lands on a recognisable market event, and none</w:t>
       </w:r>
     </w:p>
     <w:p>
       <w:r>
+        <w:rPr>
+          <w:rFonts w:ascii="Arial" w:hAnsi="Arial"/>
+        </w:rPr>
         <w:t>looks like a mechanical error: no isolated ten-fold jumps, no impossible signs,</w:t>
       </w:r>
     </w:p>
     <w:p>
       <w:r>
+        <w:rPr>
+          <w:rFonts w:ascii="Arial" w:hAnsi="Arial"/>
+        </w:rPr>
         <w:t>no values detached from their neighbours.</w:t>
       </w:r>
     </w:p>
     <w:p>
       <w:r>
         <w:rPr>
+          <w:rFonts w:ascii="Arial" w:hAnsi="Arial"/>
           <w:b/>
         </w:rPr>
         <w:t>Table A1 — Flagged observations, |modified z| &gt; 5.</w:t>
@@ -581,6 +985,7 @@
           <w:p>
             <w:r>
               <w:rPr>
+                <w:rFonts w:ascii="Arial" w:hAnsi="Arial"/>
                 <w:b/>
               </w:rPr>
               <w:t>Month</w:t>
@@ -594,6 +999,7 @@
           <w:p>
             <w:r>
               <w:rPr>
+                <w:rFonts w:ascii="Arial" w:hAnsi="Arial"/>
                 <w:b/>
               </w:rPr>
               <w:t>Series</w:t>
@@ -607,6 +1013,7 @@
           <w:p>
             <w:r>
               <w:rPr>
+                <w:rFonts w:ascii="Arial" w:hAnsi="Arial"/>
                 <w:b/>
               </w:rPr>
               <w:t>Value</w:t>
@@ -620,6 +1027,7 @@
           <w:p>
             <w:r>
               <w:rPr>
+                <w:rFonts w:ascii="Arial" w:hAnsi="Arial"/>
                 <w:b/>
               </w:rPr>
               <w:t>Robust z</w:t>
@@ -633,6 +1041,7 @@
           <w:p>
             <w:r>
               <w:rPr>
+                <w:rFonts w:ascii="Arial" w:hAnsi="Arial"/>
                 <w:b/>
               </w:rPr>
               <w:t>Event</w:t>
@@ -647,6 +1056,9 @@
           </w:tcPr>
           <w:p>
             <w:r>
+              <w:rPr>
+                <w:rFonts w:ascii="Arial" w:hAnsi="Arial"/>
+              </w:rPr>
               <w:t>2020-03</w:t>
             </w:r>
           </w:p>
@@ -657,6 +1069,9 @@
           </w:tcPr>
           <w:p>
             <w:r>
+              <w:rPr>
+                <w:rFonts w:ascii="Arial" w:hAnsi="Arial"/>
+              </w:rPr>
               <w:t>WTI return</w:t>
             </w:r>
           </w:p>
@@ -667,6 +1082,9 @@
           </w:tcPr>
           <w:p>
             <w:r>
+              <w:rPr>
+                <w:rFonts w:ascii="Arial" w:hAnsi="Arial"/>
+              </w:rPr>
               <w:t>−0.5483</w:t>
             </w:r>
           </w:p>
@@ -677,6 +1095,9 @@
           </w:tcPr>
           <w:p>
             <w:r>
+              <w:rPr>
+                <w:rFonts w:ascii="Arial" w:hAnsi="Arial"/>
+              </w:rPr>
               <w:t>−7.15</w:t>
             </w:r>
           </w:p>
@@ -687,6 +1108,9 @@
           </w:tcPr>
           <w:p>
             <w:r>
+              <w:rPr>
+                <w:rFonts w:ascii="Arial" w:hAnsi="Arial"/>
+              </w:rPr>
               <w:t>COVID demand collapse</w:t>
             </w:r>
           </w:p>
@@ -699,6 +1123,9 @@
           </w:tcPr>
           <w:p>
             <w:r>
+              <w:rPr>
+                <w:rFonts w:ascii="Arial" w:hAnsi="Arial"/>
+              </w:rPr>
               <w:t>2020-04</w:t>
             </w:r>
           </w:p>
@@ -709,6 +1136,9 @@
           </w:tcPr>
           <w:p>
             <w:r>
+              <w:rPr>
+                <w:rFonts w:ascii="Arial" w:hAnsi="Arial"/>
+              </w:rPr>
               <w:t>WTI return</w:t>
             </w:r>
           </w:p>
@@ -719,6 +1149,9 @@
           </w:tcPr>
           <w:p>
             <w:r>
+              <w:rPr>
+                <w:rFonts w:ascii="Arial" w:hAnsi="Arial"/>
+              </w:rPr>
               <w:t>−0.5681</w:t>
             </w:r>
           </w:p>
@@ -729,6 +1162,9 @@
           </w:tcPr>
           <w:p>
             <w:r>
+              <w:rPr>
+                <w:rFonts w:ascii="Arial" w:hAnsi="Arial"/>
+              </w:rPr>
               <w:t>−7.40</w:t>
             </w:r>
           </w:p>
@@ -739,6 +1175,9 @@
           </w:tcPr>
           <w:p>
             <w:r>
+              <w:rPr>
+                <w:rFonts w:ascii="Arial" w:hAnsi="Arial"/>
+              </w:rPr>
               <w:t>COVID / storage stress</w:t>
             </w:r>
           </w:p>
@@ -751,6 +1190,9 @@
           </w:tcPr>
           <w:p>
             <w:r>
+              <w:rPr>
+                <w:rFonts w:ascii="Arial" w:hAnsi="Arial"/>
+              </w:rPr>
               <w:t>2020-05</w:t>
             </w:r>
           </w:p>
@@ -761,6 +1203,9 @@
           </w:tcPr>
           <w:p>
             <w:r>
+              <w:rPr>
+                <w:rFonts w:ascii="Arial" w:hAnsi="Arial"/>
+              </w:rPr>
               <w:t>WTI return</w:t>
             </w:r>
           </w:p>
@@ -771,6 +1216,9 @@
           </w:tcPr>
           <w:p>
             <w:r>
+              <w:rPr>
+                <w:rFonts w:ascii="Arial" w:hAnsi="Arial"/>
+              </w:rPr>
               <w:t>+0.5456</w:t>
             </w:r>
           </w:p>
@@ -781,6 +1229,9 @@
           </w:tcPr>
           <w:p>
             <w:r>
+              <w:rPr>
+                <w:rFonts w:ascii="Arial" w:hAnsi="Arial"/>
+              </w:rPr>
               <w:t>+6.84</w:t>
             </w:r>
           </w:p>
@@ -791,6 +1242,9 @@
           </w:tcPr>
           <w:p>
             <w:r>
+              <w:rPr>
+                <w:rFonts w:ascii="Arial" w:hAnsi="Arial"/>
+              </w:rPr>
               <w:t>Reopening rebound</w:t>
             </w:r>
           </w:p>
@@ -803,6 +1257,9 @@
           </w:tcPr>
           <w:p>
             <w:r>
+              <w:rPr>
+                <w:rFonts w:ascii="Arial" w:hAnsi="Arial"/>
+              </w:rPr>
               <w:t>2020-03</w:t>
             </w:r>
           </w:p>
@@ -813,6 +1270,9 @@
           </w:tcPr>
           <w:p>
             <w:r>
+              <w:rPr>
+                <w:rFonts w:ascii="Arial" w:hAnsi="Arial"/>
+              </w:rPr>
               <w:t>Brent return</w:t>
             </w:r>
           </w:p>
@@ -823,6 +1283,9 @@
           </w:tcPr>
           <w:p>
             <w:r>
+              <w:rPr>
+                <w:rFonts w:ascii="Arial" w:hAnsi="Arial"/>
+              </w:rPr>
               <w:t>−0.5532</w:t>
             </w:r>
           </w:p>
@@ -833,6 +1296,9 @@
           </w:tcPr>
           <w:p>
             <w:r>
+              <w:rPr>
+                <w:rFonts w:ascii="Arial" w:hAnsi="Arial"/>
+              </w:rPr>
               <w:t>−6.68</w:t>
             </w:r>
           </w:p>
@@ -843,6 +1309,9 @@
           </w:tcPr>
           <w:p>
             <w:r>
+              <w:rPr>
+                <w:rFonts w:ascii="Arial" w:hAnsi="Arial"/>
+              </w:rPr>
               <w:t>COVID</w:t>
             </w:r>
           </w:p>
@@ -855,6 +1324,9 @@
           </w:tcPr>
           <w:p>
             <w:r>
+              <w:rPr>
+                <w:rFonts w:ascii="Arial" w:hAnsi="Arial"/>
+              </w:rPr>
               <w:t>2020-04</w:t>
             </w:r>
           </w:p>
@@ -865,6 +1337,9 @@
           </w:tcPr>
           <w:p>
             <w:r>
+              <w:rPr>
+                <w:rFonts w:ascii="Arial" w:hAnsi="Arial"/>
+              </w:rPr>
               <w:t>Brent return</w:t>
             </w:r>
           </w:p>
@@ -875,6 +1350,9 @@
           </w:tcPr>
           <w:p>
             <w:r>
+              <w:rPr>
+                <w:rFonts w:ascii="Arial" w:hAnsi="Arial"/>
+              </w:rPr>
               <w:t>−0.5548</w:t>
             </w:r>
           </w:p>
@@ -885,6 +1363,9 @@
           </w:tcPr>
           <w:p>
             <w:r>
+              <w:rPr>
+                <w:rFonts w:ascii="Arial" w:hAnsi="Arial"/>
+              </w:rPr>
               <w:t>−6.70</w:t>
             </w:r>
           </w:p>
@@ -895,6 +1376,9 @@
           </w:tcPr>
           <w:p>
             <w:r>
+              <w:rPr>
+                <w:rFonts w:ascii="Arial" w:hAnsi="Arial"/>
+              </w:rPr>
               <w:t>COVID</w:t>
             </w:r>
           </w:p>
@@ -907,6 +1391,9 @@
           </w:tcPr>
           <w:p>
             <w:r>
+              <w:rPr>
+                <w:rFonts w:ascii="Arial" w:hAnsi="Arial"/>
+              </w:rPr>
               <w:t>2020-05</w:t>
             </w:r>
           </w:p>
@@ -917,6 +1404,9 @@
           </w:tcPr>
           <w:p>
             <w:r>
+              <w:rPr>
+                <w:rFonts w:ascii="Arial" w:hAnsi="Arial"/>
+              </w:rPr>
               <w:t>Brent return</w:t>
             </w:r>
           </w:p>
@@ -927,6 +1417,9 @@
           </w:tcPr>
           <w:p>
             <w:r>
+              <w:rPr>
+                <w:rFonts w:ascii="Arial" w:hAnsi="Arial"/>
+              </w:rPr>
               <w:t>+0.4691</w:t>
             </w:r>
           </w:p>
@@ -937,6 +1430,9 @@
           </w:tcPr>
           <w:p>
             <w:r>
+              <w:rPr>
+                <w:rFonts w:ascii="Arial" w:hAnsi="Arial"/>
+              </w:rPr>
               <w:t>+5.42</w:t>
             </w:r>
           </w:p>
@@ -947,6 +1443,9 @@
           </w:tcPr>
           <w:p>
             <w:r>
+              <w:rPr>
+                <w:rFonts w:ascii="Arial" w:hAnsi="Arial"/>
+              </w:rPr>
               <w:t>Rebound</w:t>
             </w:r>
           </w:p>
@@ -959,6 +1458,9 @@
           </w:tcPr>
           <w:p>
             <w:r>
+              <w:rPr>
+                <w:rFonts w:ascii="Arial" w:hAnsi="Arial"/>
+              </w:rPr>
               <w:t>2008-10</w:t>
             </w:r>
           </w:p>
@@ -969,6 +1471,9 @@
           </w:tcPr>
           <w:p>
             <w:r>
+              <w:rPr>
+                <w:rFonts w:ascii="Arial" w:hAnsi="Arial"/>
+              </w:rPr>
               <w:t>Dollar return</w:t>
             </w:r>
           </w:p>
@@ -979,6 +1484,9 @@
           </w:tcPr>
           <w:p>
             <w:r>
+              <w:rPr>
+                <w:rFonts w:ascii="Arial" w:hAnsi="Arial"/>
+              </w:rPr>
               <w:t>+0.0716</w:t>
             </w:r>
           </w:p>
@@ -989,6 +1497,9 @@
           </w:tcPr>
           <w:p>
             <w:r>
+              <w:rPr>
+                <w:rFonts w:ascii="Arial" w:hAnsi="Arial"/>
+              </w:rPr>
               <w:t>+5.92</w:t>
             </w:r>
           </w:p>
@@ -999,6 +1510,9 @@
           </w:tcPr>
           <w:p>
             <w:r>
+              <w:rPr>
+                <w:rFonts w:ascii="Arial" w:hAnsi="Arial"/>
+              </w:rPr>
               <w:t>GFC flight to dollar</w:t>
             </w:r>
           </w:p>
@@ -1011,6 +1525,9 @@
           </w:tcPr>
           <w:p>
             <w:r>
+              <w:rPr>
+                <w:rFonts w:ascii="Arial" w:hAnsi="Arial"/>
+              </w:rPr>
               <w:t>2008-09</w:t>
             </w:r>
           </w:p>
@@ -1021,6 +1538,9 @@
           </w:tcPr>
           <w:p>
             <w:r>
+              <w:rPr>
+                <w:rFonts w:ascii="Arial" w:hAnsi="Arial"/>
+              </w:rPr>
               <w:t>VIX change</w:t>
             </w:r>
           </w:p>
@@ -1031,6 +1551,9 @@
           </w:tcPr>
           <w:p>
             <w:r>
+              <w:rPr>
+                <w:rFonts w:ascii="Arial" w:hAnsi="Arial"/>
+              </w:rPr>
               <w:t>+18.74</w:t>
             </w:r>
           </w:p>
@@ -1041,6 +1564,9 @@
           </w:tcPr>
           <w:p>
             <w:r>
+              <w:rPr>
+                <w:rFonts w:ascii="Arial" w:hAnsi="Arial"/>
+              </w:rPr>
               <w:t>+5.28</w:t>
             </w:r>
           </w:p>
@@ -1051,6 +1577,9 @@
           </w:tcPr>
           <w:p>
             <w:r>
+              <w:rPr>
+                <w:rFonts w:ascii="Arial" w:hAnsi="Arial"/>
+              </w:rPr>
               <w:t>Lehman</w:t>
             </w:r>
           </w:p>
@@ -1063,6 +1592,9 @@
           </w:tcPr>
           <w:p>
             <w:r>
+              <w:rPr>
+                <w:rFonts w:ascii="Arial" w:hAnsi="Arial"/>
+              </w:rPr>
               <w:t>2008-10</w:t>
             </w:r>
           </w:p>
@@ -1073,6 +1605,9 @@
           </w:tcPr>
           <w:p>
             <w:r>
+              <w:rPr>
+                <w:rFonts w:ascii="Arial" w:hAnsi="Arial"/>
+              </w:rPr>
               <w:t>VIX change</w:t>
             </w:r>
           </w:p>
@@ -1083,6 +1618,9 @@
           </w:tcPr>
           <w:p>
             <w:r>
+              <w:rPr>
+                <w:rFonts w:ascii="Arial" w:hAnsi="Arial"/>
+              </w:rPr>
               <w:t>+20.50</w:t>
             </w:r>
           </w:p>
@@ -1093,6 +1631,9 @@
           </w:tcPr>
           <w:p>
             <w:r>
+              <w:rPr>
+                <w:rFonts w:ascii="Arial" w:hAnsi="Arial"/>
+              </w:rPr>
               <w:t>+5.77</w:t>
             </w:r>
           </w:p>
@@ -1103,6 +1644,9 @@
           </w:tcPr>
           <w:p>
             <w:r>
+              <w:rPr>
+                <w:rFonts w:ascii="Arial" w:hAnsi="Arial"/>
+              </w:rPr>
               <w:t>GFC peak stress</w:t>
             </w:r>
           </w:p>
@@ -1115,6 +1659,9 @@
           </w:tcPr>
           <w:p>
             <w:r>
+              <w:rPr>
+                <w:rFonts w:ascii="Arial" w:hAnsi="Arial"/>
+              </w:rPr>
               <w:t>2020-02</w:t>
             </w:r>
           </w:p>
@@ -1125,6 +1672,9 @@
           </w:tcPr>
           <w:p>
             <w:r>
+              <w:rPr>
+                <w:rFonts w:ascii="Arial" w:hAnsi="Arial"/>
+              </w:rPr>
               <w:t>VIX change</w:t>
             </w:r>
           </w:p>
@@ -1135,6 +1685,9 @@
           </w:tcPr>
           <w:p>
             <w:r>
+              <w:rPr>
+                <w:rFonts w:ascii="Arial" w:hAnsi="Arial"/>
+              </w:rPr>
               <w:t>+21.27</w:t>
             </w:r>
           </w:p>
@@ -1145,6 +1698,9 @@
           </w:tcPr>
           <w:p>
             <w:r>
+              <w:rPr>
+                <w:rFonts w:ascii="Arial" w:hAnsi="Arial"/>
+              </w:rPr>
               <w:t>+5.98</w:t>
             </w:r>
           </w:p>
@@ -1155,6 +1711,9 @@
           </w:tcPr>
           <w:p>
             <w:r>
+              <w:rPr>
+                <w:rFonts w:ascii="Arial" w:hAnsi="Arial"/>
+              </w:rPr>
               <w:t>COVID shock</w:t>
             </w:r>
           </w:p>
@@ -1167,6 +1726,9 @@
           </w:tcPr>
           <w:p>
             <w:r>
+              <w:rPr>
+                <w:rFonts w:ascii="Arial" w:hAnsi="Arial"/>
+              </w:rPr>
               <w:t>2020-04</w:t>
             </w:r>
           </w:p>
@@ -1177,6 +1739,9 @@
           </w:tcPr>
           <w:p>
             <w:r>
+              <w:rPr>
+                <w:rFonts w:ascii="Arial" w:hAnsi="Arial"/>
+              </w:rPr>
               <w:t>VIX change</w:t>
             </w:r>
           </w:p>
@@ -1187,6 +1752,9 @@
           </w:tcPr>
           <w:p>
             <w:r>
+              <w:rPr>
+                <w:rFonts w:ascii="Arial" w:hAnsi="Arial"/>
+              </w:rPr>
               <w:t>−19.39</w:t>
             </w:r>
           </w:p>
@@ -1197,6 +1765,9 @@
           </w:tcPr>
           <w:p>
             <w:r>
+              <w:rPr>
+                <w:rFonts w:ascii="Arial" w:hAnsi="Arial"/>
+              </w:rPr>
               <w:t>−5.26</w:t>
             </w:r>
           </w:p>
@@ -1207,6 +1778,9 @@
           </w:tcPr>
           <w:p>
             <w:r>
+              <w:rPr>
+                <w:rFonts w:ascii="Arial" w:hAnsi="Arial"/>
+              </w:rPr>
               <w:t>Stress unwind</w:t>
             </w:r>
           </w:p>
@@ -1219,6 +1793,9 @@
           </w:tcPr>
           <w:p>
             <w:r>
+              <w:rPr>
+                <w:rFonts w:ascii="Arial" w:hAnsi="Arial"/>
+              </w:rPr>
               <w:t>2022-03</w:t>
             </w:r>
           </w:p>
@@ -1229,6 +1806,9 @@
           </w:tcPr>
           <w:p>
             <w:r>
+              <w:rPr>
+                <w:rFonts w:ascii="Arial" w:hAnsi="Arial"/>
+              </w:rPr>
               <w:t>GPR change</w:t>
             </w:r>
           </w:p>
@@ -1239,6 +1819,9 @@
           </w:tcPr>
           <w:p>
             <w:r>
+              <w:rPr>
+                <w:rFonts w:ascii="Arial" w:hAnsi="Arial"/>
+              </w:rPr>
               <w:t>+102.80</w:t>
             </w:r>
           </w:p>
@@ -1249,6 +1832,9 @@
           </w:tcPr>
           <w:p>
             <w:r>
+              <w:rPr>
+                <w:rFonts w:ascii="Arial" w:hAnsi="Arial"/>
+              </w:rPr>
               <w:t>+6.57</w:t>
             </w:r>
           </w:p>
@@ -1259,6 +1845,9 @@
           </w:tcPr>
           <w:p>
             <w:r>
+              <w:rPr>
+                <w:rFonts w:ascii="Arial" w:hAnsi="Arial"/>
+              </w:rPr>
               <w:t>Invasion of Ukraine</w:t>
             </w:r>
           </w:p>
@@ -1271,6 +1860,9 @@
           </w:tcPr>
           <w:p>
             <w:r>
+              <w:rPr>
+                <w:rFonts w:ascii="Arial" w:hAnsi="Arial"/>
+              </w:rPr>
               <w:t>2022-04</w:t>
             </w:r>
           </w:p>
@@ -1281,6 +1873,9 @@
           </w:tcPr>
           <w:p>
             <w:r>
+              <w:rPr>
+                <w:rFonts w:ascii="Arial" w:hAnsi="Arial"/>
+              </w:rPr>
               <w:t>GPR change</w:t>
             </w:r>
           </w:p>
@@ -1291,6 +1886,9 @@
           </w:tcPr>
           <w:p>
             <w:r>
+              <w:rPr>
+                <w:rFonts w:ascii="Arial" w:hAnsi="Arial"/>
+              </w:rPr>
               <w:t>−127.81</w:t>
             </w:r>
           </w:p>
@@ -1301,6 +1899,9 @@
           </w:tcPr>
           <w:p>
             <w:r>
+              <w:rPr>
+                <w:rFonts w:ascii="Arial" w:hAnsi="Arial"/>
+              </w:rPr>
               <w:t>−8.06</w:t>
             </w:r>
           </w:p>
@@ -1311,6 +1912,9 @@
           </w:tcPr>
           <w:p>
             <w:r>
+              <w:rPr>
+                <w:rFonts w:ascii="Arial" w:hAnsi="Arial"/>
+              </w:rPr>
               <w:t>Post-invasion decay</w:t>
             </w:r>
           </w:p>
@@ -1323,6 +1927,9 @@
           </w:tcPr>
           <w:p>
             <w:r>
+              <w:rPr>
+                <w:rFonts w:ascii="Arial" w:hAnsi="Arial"/>
+              </w:rPr>
               <w:t>2023-10</w:t>
             </w:r>
           </w:p>
@@ -1333,6 +1940,9 @@
           </w:tcPr>
           <w:p>
             <w:r>
+              <w:rPr>
+                <w:rFonts w:ascii="Arial" w:hAnsi="Arial"/>
+              </w:rPr>
               <w:t>GPR change</w:t>
             </w:r>
           </w:p>
@@ -1343,6 +1953,9 @@
           </w:tcPr>
           <w:p>
             <w:r>
+              <w:rPr>
+                <w:rFonts w:ascii="Arial" w:hAnsi="Arial"/>
+              </w:rPr>
               <w:t>+99.25</w:t>
             </w:r>
           </w:p>
@@ -1353,6 +1966,9 @@
           </w:tcPr>
           <w:p>
             <w:r>
+              <w:rPr>
+                <w:rFonts w:ascii="Arial" w:hAnsi="Arial"/>
+              </w:rPr>
               <w:t>+6.35</w:t>
             </w:r>
           </w:p>
@@ -1363,6 +1979,9 @@
           </w:tcPr>
           <w:p>
             <w:r>
+              <w:rPr>
+                <w:rFonts w:ascii="Arial" w:hAnsi="Arial"/>
+              </w:rPr>
               <w:t>Middle East conflict</w:t>
             </w:r>
           </w:p>
@@ -1375,6 +1994,9 @@
           </w:tcPr>
           <w:p>
             <w:r>
+              <w:rPr>
+                <w:rFonts w:ascii="Arial" w:hAnsi="Arial"/>
+              </w:rPr>
               <w:t>2025-07</w:t>
             </w:r>
           </w:p>
@@ -1385,6 +2007,9 @@
           </w:tcPr>
           <w:p>
             <w:r>
+              <w:rPr>
+                <w:rFonts w:ascii="Arial" w:hAnsi="Arial"/>
+              </w:rPr>
               <w:t>GPR change</w:t>
             </w:r>
           </w:p>
@@ -1395,6 +2020,9 @@
           </w:tcPr>
           <w:p>
             <w:r>
+              <w:rPr>
+                <w:rFonts w:ascii="Arial" w:hAnsi="Arial"/>
+              </w:rPr>
               <w:t>−86.91</w:t>
             </w:r>
           </w:p>
@@ -1405,6 +2033,9 @@
           </w:tcPr>
           <w:p>
             <w:r>
+              <w:rPr>
+                <w:rFonts w:ascii="Arial" w:hAnsi="Arial"/>
+              </w:rPr>
               <w:t>−5.47</w:t>
             </w:r>
           </w:p>
@@ -1415,6 +2046,9 @@
           </w:tcPr>
           <w:p>
             <w:r>
+              <w:rPr>
+                <w:rFonts w:ascii="Arial" w:hAnsi="Arial"/>
+              </w:rPr>
               <w:t>Risk normalisation</w:t>
             </w:r>
           </w:p>
@@ -1424,21 +2058,33 @@
     <w:p/>
     <w:p>
       <w:r>
+        <w:rPr>
+          <w:rFonts w:ascii="Arial" w:hAnsi="Arial"/>
+        </w:rPr>
         <w:t>The recommendation passed to the group: keep all fifteen months. The flags are</w:t>
       </w:r>
     </w:p>
     <w:p>
       <w:r>
+        <w:rPr>
+          <w:rFonts w:ascii="Arial" w:hAnsi="Arial"/>
+        </w:rPr>
         <w:t>handed to Student B, whose bad-data check covers the mechanical problems</w:t>
       </w:r>
     </w:p>
     <w:p>
       <w:r>
+        <w:rPr>
+          <w:rFonts w:ascii="Arial" w:hAnsi="Arial"/>
+        </w:rPr>
         <w:t>(non-positive prices, duplicates), and to Student C for the missing-value</w:t>
       </w:r>
     </w:p>
     <w:p>
       <w:r>
+        <w:rPr>
+          <w:rFonts w:ascii="Arial" w:hAnsi="Arial"/>
+        </w:rPr>
         <w:t>treatment. Figure A3 shows the flags overlaid on the WTI return series.</w:t>
       </w:r>
     </w:p>
@@ -1447,32 +2093,48 @@
         <w:pStyle w:val="Heading2"/>
       </w:pPr>
       <w:r>
-        <w:t>4. Step 7 — Distributional analysis (all datasets)</w:t>
+        <w:rPr>
+          <w:rFonts w:ascii="Arial" w:hAnsi="Arial"/>
+        </w:rPr>
+        <w:t>5. Step 7 — Distributional analysis (all datasets)</w:t>
       </w:r>
     </w:p>
     <w:p>
       <w:r>
+        <w:rPr>
+          <w:rFonts w:ascii="Arial" w:hAnsi="Arial"/>
+        </w:rPr>
         <w:t>Student A's EDA lens is the shape of each variable's distribution. Figure A4</w:t>
       </w:r>
     </w:p>
     <w:p>
       <w:r>
+        <w:rPr>
+          <w:rFonts w:ascii="Arial" w:hAnsi="Arial"/>
+        </w:rPr>
         <w:t>shows a histogram of every transformed series against its Normal fit, Figure A5</w:t>
       </w:r>
     </w:p>
     <w:p>
       <w:r>
+        <w:rPr>
+          <w:rFonts w:ascii="Arial" w:hAnsi="Arial"/>
+        </w:rPr>
         <w:t>gives the target a closer look with a Normal overlay and a Q-Q plot, and</w:t>
       </w:r>
     </w:p>
     <w:p>
       <w:r>
+        <w:rPr>
+          <w:rFonts w:ascii="Arial" w:hAnsi="Arial"/>
+        </w:rPr>
         <w:t>Table A2 collects the moments.</w:t>
       </w:r>
     </w:p>
     <w:p>
       <w:r>
         <w:rPr>
+          <w:rFonts w:ascii="Arial" w:hAnsi="Arial"/>
           <w:b/>
         </w:rPr>
         <w:t>Table A2 — Distribution summary, core sample (239 months).</w:t>
@@ -1501,6 +2163,7 @@
           <w:p>
             <w:r>
               <w:rPr>
+                <w:rFonts w:ascii="Arial" w:hAnsi="Arial"/>
                 <w:b/>
               </w:rPr>
               <w:t>Series</w:t>
@@ -1514,6 +2177,7 @@
           <w:p>
             <w:r>
               <w:rPr>
+                <w:rFonts w:ascii="Arial" w:hAnsi="Arial"/>
                 <w:b/>
               </w:rPr>
               <w:t>Mean</w:t>
@@ -1527,6 +2191,7 @@
           <w:p>
             <w:r>
               <w:rPr>
+                <w:rFonts w:ascii="Arial" w:hAnsi="Arial"/>
                 <w:b/>
               </w:rPr>
               <w:t>Std</w:t>
@@ -1540,6 +2205,7 @@
           <w:p>
             <w:r>
               <w:rPr>
+                <w:rFonts w:ascii="Arial" w:hAnsi="Arial"/>
                 <w:b/>
               </w:rPr>
               <w:t>Skew</w:t>
@@ -1553,6 +2219,7 @@
           <w:p>
             <w:r>
               <w:rPr>
+                <w:rFonts w:ascii="Arial" w:hAnsi="Arial"/>
                 <w:b/>
               </w:rPr>
               <w:t>Excess kurtosis</w:t>
@@ -1566,6 +2233,7 @@
           <w:p>
             <w:r>
               <w:rPr>
+                <w:rFonts w:ascii="Arial" w:hAnsi="Arial"/>
                 <w:b/>
               </w:rPr>
               <w:t>Min</w:t>
@@ -1579,6 +2247,7 @@
           <w:p>
             <w:r>
               <w:rPr>
+                <w:rFonts w:ascii="Arial" w:hAnsi="Arial"/>
                 <w:b/>
               </w:rPr>
               <w:t>Max</w:t>
@@ -1593,6 +2262,9 @@
           </w:tcPr>
           <w:p>
             <w:r>
+              <w:rPr>
+                <w:rFonts w:ascii="Arial" w:hAnsi="Arial"/>
+              </w:rPr>
               <w:t>WTI return</w:t>
             </w:r>
           </w:p>
@@ -1603,6 +2275,9 @@
           </w:tcPr>
           <w:p>
             <w:r>
+              <w:rPr>
+                <w:rFonts w:ascii="Arial" w:hAnsi="Arial"/>
+              </w:rPr>
               <w:t>−0.0005</w:t>
             </w:r>
           </w:p>
@@ -1613,6 +2288,9 @@
           </w:tcPr>
           <w:p>
             <w:r>
+              <w:rPr>
+                <w:rFonts w:ascii="Arial" w:hAnsi="Arial"/>
+              </w:rPr>
               <w:t>0.1065</w:t>
             </w:r>
           </w:p>
@@ -1623,6 +2301,9 @@
           </w:tcPr>
           <w:p>
             <w:r>
+              <w:rPr>
+                <w:rFonts w:ascii="Arial" w:hAnsi="Arial"/>
+              </w:rPr>
               <w:t>−0.91</w:t>
             </w:r>
           </w:p>
@@ -1633,6 +2314,9 @@
           </w:tcPr>
           <w:p>
             <w:r>
+              <w:rPr>
+                <w:rFonts w:ascii="Arial" w:hAnsi="Arial"/>
+              </w:rPr>
               <w:t>8.55</w:t>
             </w:r>
           </w:p>
@@ -1643,6 +2327,9 @@
           </w:tcPr>
           <w:p>
             <w:r>
+              <w:rPr>
+                <w:rFonts w:ascii="Arial" w:hAnsi="Arial"/>
+              </w:rPr>
               <w:t>−0.568</w:t>
             </w:r>
           </w:p>
@@ -1653,6 +2340,9 @@
           </w:tcPr>
           <w:p>
             <w:r>
+              <w:rPr>
+                <w:rFonts w:ascii="Arial" w:hAnsi="Arial"/>
+              </w:rPr>
               <w:t>0.546</w:t>
             </w:r>
           </w:p>
@@ -1665,6 +2355,9 @@
           </w:tcPr>
           <w:p>
             <w:r>
+              <w:rPr>
+                <w:rFonts w:ascii="Arial" w:hAnsi="Arial"/>
+              </w:rPr>
               <w:t>Brent return</w:t>
             </w:r>
           </w:p>
@@ -1675,6 +2368,9 @@
           </w:tcPr>
           <w:p>
             <w:r>
+              <w:rPr>
+                <w:rFonts w:ascii="Arial" w:hAnsi="Arial"/>
+              </w:rPr>
               <w:t>−0.0000</w:t>
             </w:r>
           </w:p>
@@ -1685,6 +2381,9 @@
           </w:tcPr>
           <w:p>
             <w:r>
+              <w:rPr>
+                <w:rFonts w:ascii="Arial" w:hAnsi="Arial"/>
+              </w:rPr>
               <w:t>0.1056</w:t>
             </w:r>
           </w:p>
@@ -1695,6 +2394,9 @@
           </w:tcPr>
           <w:p>
             <w:r>
+              <w:rPr>
+                <w:rFonts w:ascii="Arial" w:hAnsi="Arial"/>
+              </w:rPr>
               <w:t>−1.15</w:t>
             </w:r>
           </w:p>
@@ -1705,6 +2407,9 @@
           </w:tcPr>
           <w:p>
             <w:r>
+              <w:rPr>
+                <w:rFonts w:ascii="Arial" w:hAnsi="Arial"/>
+              </w:rPr>
               <w:t>7.41</w:t>
             </w:r>
           </w:p>
@@ -1715,6 +2420,9 @@
           </w:tcPr>
           <w:p>
             <w:r>
+              <w:rPr>
+                <w:rFonts w:ascii="Arial" w:hAnsi="Arial"/>
+              </w:rPr>
               <w:t>−0.555</w:t>
             </w:r>
           </w:p>
@@ -1725,6 +2433,9 @@
           </w:tcPr>
           <w:p>
             <w:r>
+              <w:rPr>
+                <w:rFonts w:ascii="Arial" w:hAnsi="Arial"/>
+              </w:rPr>
               <w:t>0.469</w:t>
             </w:r>
           </w:p>
@@ -1737,6 +2448,9 @@
           </w:tcPr>
           <w:p>
             <w:r>
+              <w:rPr>
+                <w:rFonts w:ascii="Arial" w:hAnsi="Arial"/>
+              </w:rPr>
               <w:t>Dollar return</w:t>
             </w:r>
           </w:p>
@@ -1747,6 +2461,9 @@
           </w:tcPr>
           <w:p>
             <w:r>
+              <w:rPr>
+                <w:rFonts w:ascii="Arial" w:hAnsi="Arial"/>
+              </w:rPr>
               <w:t>0.0008</w:t>
             </w:r>
           </w:p>
@@ -1757,6 +2474,9 @@
           </w:tcPr>
           <w:p>
             <w:r>
+              <w:rPr>
+                <w:rFonts w:ascii="Arial" w:hAnsi="Arial"/>
+              </w:rPr>
               <w:t>0.0133</w:t>
             </w:r>
           </w:p>
@@ -1767,6 +2487,9 @@
           </w:tcPr>
           <w:p>
             <w:r>
+              <w:rPr>
+                <w:rFonts w:ascii="Arial" w:hAnsi="Arial"/>
+              </w:rPr>
               <w:t>+0.75</w:t>
             </w:r>
           </w:p>
@@ -1777,6 +2500,9 @@
           </w:tcPr>
           <w:p>
             <w:r>
+              <w:rPr>
+                <w:rFonts w:ascii="Arial" w:hAnsi="Arial"/>
+              </w:rPr>
               <w:t>2.63</w:t>
             </w:r>
           </w:p>
@@ -1787,6 +2513,9 @@
           </w:tcPr>
           <w:p>
             <w:r>
+              <w:rPr>
+                <w:rFonts w:ascii="Arial" w:hAnsi="Arial"/>
+              </w:rPr>
               <w:t>−0.032</w:t>
             </w:r>
           </w:p>
@@ -1797,6 +2526,9 @@
           </w:tcPr>
           <w:p>
             <w:r>
+              <w:rPr>
+                <w:rFonts w:ascii="Arial" w:hAnsi="Arial"/>
+              </w:rPr>
               <w:t>0.072</w:t>
             </w:r>
           </w:p>
@@ -1809,6 +2541,9 @@
           </w:tcPr>
           <w:p>
             <w:r>
+              <w:rPr>
+                <w:rFonts w:ascii="Arial" w:hAnsi="Arial"/>
+              </w:rPr>
               <w:t>VIX change</w:t>
             </w:r>
           </w:p>
@@ -1819,6 +2554,9 @@
           </w:tcPr>
           <w:p>
             <w:r>
+              <w:rPr>
+                <w:rFonts w:ascii="Arial" w:hAnsi="Arial"/>
+              </w:rPr>
               <w:t>0.0084</w:t>
             </w:r>
           </w:p>
@@ -1829,6 +2567,9 @@
           </w:tcPr>
           <w:p>
             <w:r>
+              <w:rPr>
+                <w:rFonts w:ascii="Arial" w:hAnsi="Arial"/>
+              </w:rPr>
               <w:t>5.32</w:t>
             </w:r>
           </w:p>
@@ -1839,6 +2580,9 @@
           </w:tcPr>
           <w:p>
             <w:r>
+              <w:rPr>
+                <w:rFonts w:ascii="Arial" w:hAnsi="Arial"/>
+              </w:rPr>
               <w:t>+0.43</w:t>
             </w:r>
           </w:p>
@@ -1849,6 +2593,9 @@
           </w:tcPr>
           <w:p>
             <w:r>
+              <w:rPr>
+                <w:rFonts w:ascii="Arial" w:hAnsi="Arial"/>
+              </w:rPr>
               <w:t>3.32</w:t>
             </w:r>
           </w:p>
@@ -1859,6 +2606,9 @@
           </w:tcPr>
           <w:p>
             <w:r>
+              <w:rPr>
+                <w:rFonts w:ascii="Arial" w:hAnsi="Arial"/>
+              </w:rPr>
               <w:t>−19.4</w:t>
             </w:r>
           </w:p>
@@ -1869,6 +2619,9 @@
           </w:tcPr>
           <w:p>
             <w:r>
+              <w:rPr>
+                <w:rFonts w:ascii="Arial" w:hAnsi="Arial"/>
+              </w:rPr>
               <w:t>21.3</w:t>
             </w:r>
           </w:p>
@@ -1881,6 +2634,9 @@
           </w:tcPr>
           <w:p>
             <w:r>
+              <w:rPr>
+                <w:rFonts w:ascii="Arial" w:hAnsi="Arial"/>
+              </w:rPr>
               <w:t>Inventory change</w:t>
             </w:r>
           </w:p>
@@ -1891,6 +2647,9 @@
           </w:tcPr>
           <w:p>
             <w:r>
+              <w:rPr>
+                <w:rFonts w:ascii="Arial" w:hAnsi="Arial"/>
+              </w:rPr>
               <w:t>504</w:t>
             </w:r>
           </w:p>
@@ -1901,6 +2660,9 @@
           </w:tcPr>
           <w:p>
             <w:r>
+              <w:rPr>
+                <w:rFonts w:ascii="Arial" w:hAnsi="Arial"/>
+              </w:rPr>
               <w:t>11,969</w:t>
             </w:r>
           </w:p>
@@ -1911,6 +2673,9 @@
           </w:tcPr>
           <w:p>
             <w:r>
+              <w:rPr>
+                <w:rFonts w:ascii="Arial" w:hAnsi="Arial"/>
+              </w:rPr>
               <w:t>+0.47</w:t>
             </w:r>
           </w:p>
@@ -1921,6 +2686,9 @@
           </w:tcPr>
           <w:p>
             <w:r>
+              <w:rPr>
+                <w:rFonts w:ascii="Arial" w:hAnsi="Arial"/>
+              </w:rPr>
               <w:t>0.88</w:t>
             </w:r>
           </w:p>
@@ -1931,6 +2699,9 @@
           </w:tcPr>
           <w:p>
             <w:r>
+              <w:rPr>
+                <w:rFonts w:ascii="Arial" w:hAnsi="Arial"/>
+              </w:rPr>
               <w:t>−27,362</w:t>
             </w:r>
           </w:p>
@@ -1941,6 +2712,9 @@
           </w:tcPr>
           <w:p>
             <w:r>
+              <w:rPr>
+                <w:rFonts w:ascii="Arial" w:hAnsi="Arial"/>
+              </w:rPr>
               <w:t>51,047</w:t>
             </w:r>
           </w:p>
@@ -1953,6 +2727,9 @@
           </w:tcPr>
           <w:p>
             <w:r>
+              <w:rPr>
+                <w:rFonts w:ascii="Arial" w:hAnsi="Arial"/>
+              </w:rPr>
               <w:t>GPR change</w:t>
             </w:r>
           </w:p>
@@ -1963,6 +2740,9 @@
           </w:tcPr>
           <w:p>
             <w:r>
+              <w:rPr>
+                <w:rFonts w:ascii="Arial" w:hAnsi="Arial"/>
+              </w:rPr>
               <w:t>0.16</w:t>
             </w:r>
           </w:p>
@@ -1973,6 +2753,9 @@
           </w:tcPr>
           <w:p>
             <w:r>
+              <w:rPr>
+                <w:rFonts w:ascii="Arial" w:hAnsi="Arial"/>
+              </w:rPr>
               <w:t>23.9</w:t>
             </w:r>
           </w:p>
@@ -1983,6 +2766,9 @@
           </w:tcPr>
           <w:p>
             <w:r>
+              <w:rPr>
+                <w:rFonts w:ascii="Arial" w:hAnsi="Arial"/>
+              </w:rPr>
               <w:t>+0.02</w:t>
             </w:r>
           </w:p>
@@ -1993,6 +2779,9 @@
           </w:tcPr>
           <w:p>
             <w:r>
+              <w:rPr>
+                <w:rFonts w:ascii="Arial" w:hAnsi="Arial"/>
+              </w:rPr>
               <w:t>6.30</w:t>
             </w:r>
           </w:p>
@@ -2003,6 +2792,9 @@
           </w:tcPr>
           <w:p>
             <w:r>
+              <w:rPr>
+                <w:rFonts w:ascii="Arial" w:hAnsi="Arial"/>
+              </w:rPr>
               <w:t>−127.8</w:t>
             </w:r>
           </w:p>
@@ -2013,6 +2805,9 @@
           </w:tcPr>
           <w:p>
             <w:r>
+              <w:rPr>
+                <w:rFonts w:ascii="Arial" w:hAnsi="Arial"/>
+              </w:rPr>
               <w:t>102.8</w:t>
             </w:r>
           </w:p>
@@ -2022,81 +2817,129 @@
     <w:p/>
     <w:p>
       <w:r>
+        <w:rPr>
+          <w:rFonts w:ascii="Arial" w:hAnsi="Arial"/>
+        </w:rPr>
         <w:t>Three observations. First, the target is the worst-behaved series in the panel:</w:t>
       </w:r>
     </w:p>
     <w:p>
       <w:r>
+        <w:rPr>
+          <w:rFonts w:ascii="Arial" w:hAnsi="Arial"/>
+        </w:rPr>
         <w:t>WTI returns are left-skewed (−0.91) with excess kurtosis of 8.55, and a</w:t>
       </w:r>
     </w:p>
     <w:p>
       <w:r>
+        <w:rPr>
+          <w:rFonts w:ascii="Arial" w:hAnsi="Arial"/>
+        </w:rPr>
         <w:t>Jarque–Bera test rejects Normality at any conventional level. The Q-Q plot</w:t>
       </w:r>
     </w:p>
     <w:p>
       <w:r>
+        <w:rPr>
+          <w:rFonts w:ascii="Arial" w:hAnsi="Arial"/>
+        </w:rPr>
         <w:t>bends off the reference line at both ends — the visual signature of fat tails.</w:t>
       </w:r>
     </w:p>
     <w:p>
       <w:r>
+        <w:rPr>
+          <w:rFonts w:ascii="Arial" w:hAnsi="Arial"/>
+        </w:rPr>
         <w:t>Second, the skews are not all the same direction. The oil benchmarks skew</w:t>
       </w:r>
     </w:p>
     <w:p>
       <w:r>
+        <w:rPr>
+          <w:rFonts w:ascii="Arial" w:hAnsi="Arial"/>
+        </w:rPr>
         <w:t>*negative* (crashes are bigger than rallies), while the dollar, the VIX and GPR</w:t>
       </w:r>
     </w:p>
     <w:p>
       <w:r>
+        <w:rPr>
+          <w:rFonts w:ascii="Arial" w:hAnsi="Arial"/>
+        </w:rPr>
         <w:t>skew *positive* — stress variables spike upward. That asymmetry is economically</w:t>
       </w:r>
     </w:p>
     <w:p>
       <w:r>
+        <w:rPr>
+          <w:rFonts w:ascii="Arial" w:hAnsi="Arial"/>
+        </w:rPr>
         <w:t>sensible: the same event that produces an extreme negative oil month produces</w:t>
       </w:r>
     </w:p>
     <w:p>
       <w:r>
+        <w:rPr>
+          <w:rFonts w:ascii="Arial" w:hAnsi="Arial"/>
+        </w:rPr>
         <w:t>an extreme positive dollar, VIX and GPR month. Third, the inventory change is</w:t>
       </w:r>
     </w:p>
     <w:p>
       <w:r>
+        <w:rPr>
+          <w:rFonts w:ascii="Arial" w:hAnsi="Arial"/>
+        </w:rPr>
         <w:t>the closest thing to a Normal variable in the panel (excess kurtosis 0.88),</w:t>
       </w:r>
     </w:p>
     <w:p>
       <w:r>
+        <w:rPr>
+          <w:rFonts w:ascii="Arial" w:hAnsi="Arial"/>
+        </w:rPr>
         <w:t>which is what one would expect from a smoothed physical-stock series.</w:t>
       </w:r>
     </w:p>
     <w:p>
       <w:r>
+        <w:rPr>
+          <w:rFonts w:ascii="Arial" w:hAnsi="Arial"/>
+        </w:rPr>
         <w:t>The practical conclusion for the group: no Gaussian assumption survives this</w:t>
       </w:r>
     </w:p>
     <w:p>
       <w:r>
+        <w:rPr>
+          <w:rFonts w:ascii="Arial" w:hAnsi="Arial"/>
+        </w:rPr>
         <w:t>panel. That finding is what justifies moving to discretized states —</w:t>
       </w:r>
     </w:p>
     <w:p>
       <w:r>
+        <w:rPr>
+          <w:rFonts w:ascii="Arial" w:hAnsi="Arial"/>
+        </w:rPr>
         <w:t>Down/Flat/Up for the target, Low/Medium/High for drivers — before the</w:t>
       </w:r>
     </w:p>
     <w:p>
       <w:r>
+        <w:rPr>
+          <w:rFonts w:ascii="Arial" w:hAnsi="Arial"/>
+        </w:rPr>
         <w:t>Bayesian-network stage, since conditional probability tables make no</w:t>
       </w:r>
     </w:p>
     <w:p>
       <w:r>
+        <w:rPr>
+          <w:rFonts w:ascii="Arial" w:hAnsi="Arial"/>
+        </w:rPr>
         <w:t>distributional assumption at all.</w:t>
       </w:r>
     </w:p>
@@ -2105,245 +2948,381 @@
         <w:pStyle w:val="Heading2"/>
       </w:pPr>
       <w:r>
-        <w:t>5. Step 9 — Probabilistic graphical models: belief networks and Markov networks</w:t>
+        <w:rPr>
+          <w:rFonts w:ascii="Arial" w:hAnsi="Arial"/>
+        </w:rPr>
+        <w:t>6. Step 9 — Probabilistic graphical models: belief networks and Markov networks</w:t>
       </w:r>
     </w:p>
     <w:p>
       <w:r>
         <w:rPr>
+          <w:rFonts w:ascii="Arial" w:hAnsi="Arial"/>
           <w:b/>
         </w:rPr>
         <w:t>What a PGM is.</w:t>
       </w:r>
       <w:r>
+        <w:rPr>
+          <w:rFonts w:ascii="Arial" w:hAnsi="Arial"/>
+        </w:rPr>
         <w:t xml:space="preserve"> A probabilistic graphical model represents a joint</w:t>
       </w:r>
     </w:p>
     <w:p>
       <w:r>
+        <w:rPr>
+          <w:rFonts w:ascii="Arial" w:hAnsi="Arial"/>
+        </w:rPr>
         <w:t>probability distribution with a graph. Nodes are random variables; edges mark</w:t>
       </w:r>
     </w:p>
     <w:p>
       <w:r>
+        <w:rPr>
+          <w:rFonts w:ascii="Arial" w:hAnsi="Arial"/>
+        </w:rPr>
         <w:t>direct probabilistic dependence; and — the part that does the real work — a</w:t>
       </w:r>
     </w:p>
     <w:p>
       <w:r>
+        <w:rPr>
+          <w:rFonts w:ascii="Arial" w:hAnsi="Arial"/>
+        </w:rPr>
         <w:t>*missing* edge is a statement of conditional independence. This matters because</w:t>
       </w:r>
     </w:p>
     <w:p>
       <w:r>
+        <w:rPr>
+          <w:rFonts w:ascii="Arial" w:hAnsi="Arial"/>
+        </w:rPr>
         <w:t>a joint distribution over even a handful of discretized variables is too large</w:t>
       </w:r>
     </w:p>
     <w:p>
       <w:r>
+        <w:rPr>
+          <w:rFonts w:ascii="Arial" w:hAnsi="Arial"/>
+        </w:rPr>
         <w:t>to estimate honestly from 239 monthly observations. The graph factorises that</w:t>
       </w:r>
     </w:p>
     <w:p>
       <w:r>
+        <w:rPr>
+          <w:rFonts w:ascii="Arial" w:hAnsi="Arial"/>
+        </w:rPr>
         <w:t>joint distribution into small local pieces, each estimable on its own, and it</w:t>
       </w:r>
     </w:p>
     <w:p>
       <w:r>
+        <w:rPr>
+          <w:rFonts w:ascii="Arial" w:hAnsi="Arial"/>
+        </w:rPr>
         <w:t>does so in a form a human can read and challenge. If the graph asserts</w:t>
       </w:r>
     </w:p>
     <w:p>
       <w:r>
+        <w:rPr>
+          <w:rFonts w:ascii="Arial" w:hAnsi="Arial"/>
+        </w:rPr>
         <w:t>something economically absurd, the group can see it and fix it before the model</w:t>
       </w:r>
     </w:p>
     <w:p>
       <w:r>
+        <w:rPr>
+          <w:rFonts w:ascii="Arial" w:hAnsi="Arial"/>
+        </w:rPr>
         <w:t>is used, which is not true of most black-box alternatives.</w:t>
       </w:r>
     </w:p>
     <w:p>
       <w:r>
         <w:rPr>
+          <w:rFonts w:ascii="Arial" w:hAnsi="Arial"/>
           <w:b/>
         </w:rPr>
         <w:t>Belief networks.</w:t>
       </w:r>
       <w:r>
+        <w:rPr>
+          <w:rFonts w:ascii="Arial" w:hAnsi="Arial"/>
+        </w:rPr>
         <w:t xml:space="preserve"> A belief network — the term Bayesian network is used</w:t>
       </w:r>
     </w:p>
     <w:p>
       <w:r>
+        <w:rPr>
+          <w:rFonts w:ascii="Arial" w:hAnsi="Arial"/>
+        </w:rPr>
         <w:t>interchangeably — is built on a *directed acyclic graph*. Each node carries a</w:t>
       </w:r>
     </w:p>
     <w:p>
       <w:r>
+        <w:rPr>
+          <w:rFonts w:ascii="Arial" w:hAnsi="Arial"/>
+        </w:rPr>
         <w:t>conditional probability distribution given its parents, and the joint</w:t>
       </w:r>
     </w:p>
     <w:p>
       <w:r>
+        <w:rPr>
+          <w:rFonts w:ascii="Arial" w:hAnsi="Arial"/>
+        </w:rPr>
         <w:t>distribution factorises as the product of those local distributions. Two</w:t>
       </w:r>
     </w:p>
     <w:p>
       <w:r>
+        <w:rPr>
+          <w:rFonts w:ascii="Arial" w:hAnsi="Arial"/>
+        </w:rPr>
         <w:t>properties follow from the direction of the edges. First, the graph can express</w:t>
       </w:r>
     </w:p>
     <w:p>
       <w:r>
+        <w:rPr>
+          <w:rFonts w:ascii="Arial" w:hAnsi="Arial"/>
+        </w:rPr>
         <w:t>asymmetric relationships: "a geopolitical-risk spike raises the probability of</w:t>
       </w:r>
     </w:p>
     <w:p>
       <w:r>
+        <w:rPr>
+          <w:rFonts w:ascii="Arial" w:hAnsi="Arial"/>
+        </w:rPr>
         <w:t>an extreme oil month" is a directed statement, and the reverse claim is a</w:t>
       </w:r>
     </w:p>
     <w:p>
       <w:r>
+        <w:rPr>
+          <w:rFonts w:ascii="Arial" w:hAnsi="Arial"/>
+        </w:rPr>
         <w:t>different edge. Second, the network supports *evidence updating*: fix the</w:t>
       </w:r>
     </w:p>
     <w:p>
       <w:r>
+        <w:rPr>
+          <w:rFonts w:ascii="Arial" w:hAnsi="Arial"/>
+        </w:rPr>
         <w:t>observed nodes (the dollar strengthened, GPR is elevated), and the conditional</w:t>
       </w:r>
     </w:p>
     <w:p>
       <w:r>
+        <w:rPr>
+          <w:rFonts w:ascii="Arial" w:hAnsi="Arial"/>
+        </w:rPr>
         <w:t>distribution of the target node follows from the factorisation. That is</w:t>
       </w:r>
     </w:p>
     <w:p>
       <w:r>
+        <w:rPr>
+          <w:rFonts w:ascii="Arial" w:hAnsi="Arial"/>
+        </w:rPr>
         <w:t>precisely the scenario question a risk desk asks, and it is why the group's</w:t>
       </w:r>
     </w:p>
     <w:p>
       <w:r>
+        <w:rPr>
+          <w:rFonts w:ascii="Arial" w:hAnsi="Arial"/>
+        </w:rPr>
         <w:t>project is framed around this family.</w:t>
       </w:r>
     </w:p>
     <w:p>
       <w:r>
         <w:rPr>
+          <w:rFonts w:ascii="Arial" w:hAnsi="Arial"/>
           <w:b/>
         </w:rPr>
         <w:t>Markov networks.</w:t>
       </w:r>
       <w:r>
+        <w:rPr>
+          <w:rFonts w:ascii="Arial" w:hAnsi="Arial"/>
+        </w:rPr>
         <w:t xml:space="preserve"> A Markov network — also called a Markov random field —</w:t>
       </w:r>
     </w:p>
     <w:p>
       <w:r>
+        <w:rPr>
+          <w:rFonts w:ascii="Arial" w:hAnsi="Arial"/>
+        </w:rPr>
         <w:t>uses an *undirected* graph. Edges represent symmetric association; the joint</w:t>
       </w:r>
     </w:p>
     <w:p>
       <w:r>
+        <w:rPr>
+          <w:rFonts w:ascii="Arial" w:hAnsi="Arial"/>
+        </w:rPr>
         <w:t>distribution factorises over the graph's cliques through non-negative potential</w:t>
       </w:r>
     </w:p>
     <w:p>
       <w:r>
+        <w:rPr>
+          <w:rFonts w:ascii="Arial" w:hAnsi="Arial"/>
+        </w:rPr>
         <w:t>functions; and because potentials are not probabilities, a normalising constant</w:t>
       </w:r>
     </w:p>
     <w:p>
       <w:r>
+        <w:rPr>
+          <w:rFonts w:ascii="Arial" w:hAnsi="Arial"/>
+        </w:rPr>
         <w:t>(the partition function) is required, which is often the expensive part.</w:t>
       </w:r>
     </w:p>
     <w:p>
       <w:r>
+        <w:rPr>
+          <w:rFonts w:ascii="Arial" w:hAnsi="Arial"/>
+        </w:rPr>
         <w:t>Markov networks are the natural tool where dependence has no direction —</w:t>
       </w:r>
     </w:p>
     <w:p>
       <w:r>
+        <w:rPr>
+          <w:rFonts w:ascii="Arial" w:hAnsi="Arial"/>
+        </w:rPr>
         <w:t>spatial data, image models, contemporaneous co-movement between market</w:t>
       </w:r>
     </w:p>
     <w:p>
       <w:r>
+        <w:rPr>
+          <w:rFonts w:ascii="Arial" w:hAnsi="Arial"/>
+        </w:rPr>
         <w:t>variables. What they cannot do, by construction, is say which way an influence</w:t>
       </w:r>
     </w:p>
     <w:p>
       <w:r>
+        <w:rPr>
+          <w:rFonts w:ascii="Arial" w:hAnsi="Arial"/>
+        </w:rPr>
         <w:t>runs.</w:t>
       </w:r>
     </w:p>
     <w:p>
       <w:r>
         <w:rPr>
+          <w:rFonts w:ascii="Arial" w:hAnsi="Arial"/>
           <w:b/>
         </w:rPr>
         <w:t>How the two relate in this project.</w:t>
       </w:r>
       <w:r>
+        <w:rPr>
+          <w:rFonts w:ascii="Arial" w:hAnsi="Arial"/>
+        </w:rPr>
         <w:t xml:space="preserve"> The distinction is not a ranking; it is</w:t>
       </w:r>
     </w:p>
     <w:p>
       <w:r>
+        <w:rPr>
+          <w:rFonts w:ascii="Arial" w:hAnsi="Arial"/>
+        </w:rPr>
         <w:t>a division of labour. The group's forecasting question — how does the WTI</w:t>
       </w:r>
     </w:p>
     <w:p>
       <w:r>
+        <w:rPr>
+          <w:rFonts w:ascii="Arial" w:hAnsi="Arial"/>
+        </w:rPr>
         <w:t>return state respond to observed driver states — needs direction, so the model</w:t>
       </w:r>
     </w:p>
     <w:p>
       <w:r>
+        <w:rPr>
+          <w:rFonts w:ascii="Arial" w:hAnsi="Arial"/>
+        </w:rPr>
         <w:t>of record is a belief network. But the undirected view still appears inside the</w:t>
       </w:r>
     </w:p>
     <w:p>
       <w:r>
+        <w:rPr>
+          <w:rFonts w:ascii="Arial" w:hAnsi="Arial"/>
+        </w:rPr>
         <w:t>workflow: constraint-based structure learning first recovers an undirected</w:t>
       </w:r>
     </w:p>
     <w:p>
       <w:r>
+        <w:rPr>
+          <w:rFonts w:ascii="Arial" w:hAnsi="Arial"/>
+        </w:rPr>
         <w:t>*skeleton* from conditional-independence tests, and only then orients edges</w:t>
       </w:r>
     </w:p>
     <w:p>
       <w:r>
+        <w:rPr>
+          <w:rFonts w:ascii="Arial" w:hAnsi="Arial"/>
+        </w:rPr>
         <w:t>(colliders first, then propagation rules). The skeleton phase is, in effect, a</w:t>
       </w:r>
     </w:p>
     <w:p>
       <w:r>
+        <w:rPr>
+          <w:rFonts w:ascii="Arial" w:hAnsi="Arial"/>
+        </w:rPr>
         <w:t>Markov-network view of the data that the algorithm subsequently sharpens into a</w:t>
       </w:r>
     </w:p>
     <w:p>
       <w:r>
+        <w:rPr>
+          <w:rFonts w:ascii="Arial" w:hAnsi="Arial"/>
+        </w:rPr>
         <w:t>belief network. One caution belongs in the record: a directed edge recovered</w:t>
       </w:r>
     </w:p>
     <w:p>
       <w:r>
+        <w:rPr>
+          <w:rFonts w:ascii="Arial" w:hAnsi="Arial"/>
+        </w:rPr>
         <w:t>this way is a modelling hypothesis consistent with the data's independence</w:t>
       </w:r>
     </w:p>
     <w:p>
       <w:r>
+        <w:rPr>
+          <w:rFonts w:ascii="Arial" w:hAnsi="Arial"/>
+        </w:rPr>
         <w:t>structure, not proof of economic causation, and the group's report treats it</w:t>
       </w:r>
     </w:p>
     <w:p>
       <w:r>
+        <w:rPr>
+          <w:rFonts w:ascii="Arial" w:hAnsi="Arial"/>
+        </w:rPr>
         <w:t>that way throughout.</w:t>
       </w:r>
     </w:p>
@@ -2352,6 +3331,9 @@
         <w:jc w:val="center"/>
       </w:pPr>
       <w:r>
+        <w:rPr>
+          <w:rFonts w:ascii="Arial" w:hAnsi="Arial"/>
+        </w:rPr>
         <w:t>____________________________________________________________</w:t>
       </w:r>
     </w:p>
@@ -2360,56 +3342,89 @@
         <w:pStyle w:val="Heading2"/>
       </w:pPr>
       <w:r>
+        <w:rPr>
+          <w:rFonts w:ascii="Arial" w:hAnsi="Arial"/>
+        </w:rPr>
         <w:t>Works Cited</w:t>
       </w:r>
     </w:p>
     <w:p>
       <w:r>
+        <w:rPr>
+          <w:rFonts w:ascii="Arial" w:hAnsi="Arial"/>
+        </w:rPr>
         <w:t>Alvi, Danish A. *Application of Probabilistic Graphical Models in Forecasting</w:t>
       </w:r>
     </w:p>
     <w:p>
       <w:r>
+        <w:rPr>
+          <w:rFonts w:ascii="Arial" w:hAnsi="Arial"/>
+        </w:rPr>
         <w:t>Crude Oil Price.* 2018. University College London, Dissertation.</w:t>
       </w:r>
     </w:p>
     <w:p>
       <w:r>
+        <w:rPr>
+          <w:rFonts w:ascii="Arial" w:hAnsi="Arial"/>
+        </w:rPr>
         <w:t>Board of Governors of the Federal Reserve System (US). "Nominal Broad U.S.</w:t>
       </w:r>
     </w:p>
     <w:p>
       <w:r>
+        <w:rPr>
+          <w:rFonts w:ascii="Arial" w:hAnsi="Arial"/>
+        </w:rPr>
         <w:t>Dollar Index [TWEXBGSMTH]." *FRED*, Federal Reserve Bank of St. Louis.</w:t>
       </w:r>
     </w:p>
     <w:p>
       <w:r>
+        <w:rPr>
+          <w:rFonts w:ascii="Arial" w:hAnsi="Arial"/>
+        </w:rPr>
         <w:t>Caldara, Dario, and Matteo Iacoviello. "Measuring Geopolitical Risk."</w:t>
       </w:r>
     </w:p>
     <w:p>
       <w:r>
+        <w:rPr>
+          <w:rFonts w:ascii="Arial" w:hAnsi="Arial"/>
+        </w:rPr>
         <w:t>*American Economic Review*, vol. 112, no. 4, 2022, pp. 1194–1225.</w:t>
       </w:r>
     </w:p>
     <w:p>
       <w:r>
+        <w:rPr>
+          <w:rFonts w:ascii="Arial" w:hAnsi="Arial"/>
+        </w:rPr>
         <w:t>Koller, Daphne, and Nir Friedman. *Probabilistic Graphical Models: Principles</w:t>
       </w:r>
     </w:p>
     <w:p>
       <w:r>
+        <w:rPr>
+          <w:rFonts w:ascii="Arial" w:hAnsi="Arial"/>
+        </w:rPr>
         <w:t>and Techniques.* MIT Press, 2009.</w:t>
       </w:r>
     </w:p>
     <w:p>
       <w:r>
+        <w:rPr>
+          <w:rFonts w:ascii="Arial" w:hAnsi="Arial"/>
+        </w:rPr>
         <w:t>U.S. Energy Information Administration. "Petroleum &amp; Other Liquids." *EIA*,</w:t>
       </w:r>
     </w:p>
     <w:p>
       <w:r>
+        <w:rPr>
+          <w:rFonts w:ascii="Arial" w:hAnsi="Arial"/>
+        </w:rPr>
         <w:t>www.eia.gov/petroleum/data.php.</w:t>
       </w:r>
     </w:p>
@@ -2418,6 +3433,9 @@
         <w:jc w:val="center"/>
       </w:pPr>
       <w:r>
+        <w:rPr>
+          <w:rFonts w:ascii="Arial" w:hAnsi="Arial"/>
+        </w:rPr>
         <w:t>____________________________________________________________</w:t>
       </w:r>
     </w:p>
@@ -2426,12 +3444,16 @@
         <w:pStyle w:val="Heading2"/>
       </w:pPr>
       <w:r>
+        <w:rPr>
+          <w:rFonts w:ascii="Arial" w:hAnsi="Arial"/>
+        </w:rPr>
         <w:t>Appendix — Figures</w:t>
       </w:r>
     </w:p>
     <w:p>
       <w:r>
         <w:rPr>
+          <w:rFonts w:ascii="Arial" w:hAnsi="Arial"/>
           <w:b/>
         </w:rPr>
         <w:t>Figure A1 — Student A variables in levels: dollar index and GPR (full history).</w:t>
@@ -2442,6 +3464,9 @@
         <w:jc w:val="center"/>
       </w:pPr>
       <w:r>
+        <w:rPr>
+          <w:rFonts w:ascii="Arial" w:hAnsi="Arial"/>
+        </w:rPr>
         <w:drawing>
           <wp:inline xmlns:a="http://schemas.openxmlformats.org/drawingml/2006/main" xmlns:pic="http://schemas.openxmlformats.org/drawingml/2006/picture">
             <wp:extent cx="5669280" cy="3488788"/>
@@ -2479,6 +3504,7 @@
     <w:p>
       <w:r>
         <w:rPr>
+          <w:rFonts w:ascii="Arial" w:hAnsi="Arial"/>
           <w:b/>
         </w:rPr>
         <w:t>Figure A2 — Structured to the core sample: dollar monthly return and GPR monthly change.</w:t>
@@ -2489,6 +3515,9 @@
         <w:jc w:val="center"/>
       </w:pPr>
       <w:r>
+        <w:rPr>
+          <w:rFonts w:ascii="Arial" w:hAnsi="Arial"/>
+        </w:rPr>
         <w:drawing>
           <wp:inline xmlns:a="http://schemas.openxmlformats.org/drawingml/2006/main" xmlns:pic="http://schemas.openxmlformats.org/drawingml/2006/picture">
             <wp:extent cx="5669280" cy="3052689"/>
@@ -2526,6 +3555,7 @@
     <w:p>
       <w:r>
         <w:rPr>
+          <w:rFonts w:ascii="Arial" w:hAnsi="Arial"/>
           <w:b/>
         </w:rPr>
         <w:t>Figure A3 — Outlier flags on WTI monthly returns (flagged, kept).</w:t>
@@ -2536,6 +3566,9 @@
         <w:jc w:val="center"/>
       </w:pPr>
       <w:r>
+        <w:rPr>
+          <w:rFonts w:ascii="Arial" w:hAnsi="Arial"/>
+        </w:rPr>
         <w:drawing>
           <wp:inline xmlns:a="http://schemas.openxmlformats.org/drawingml/2006/main" xmlns:pic="http://schemas.openxmlformats.org/drawingml/2006/picture">
             <wp:extent cx="5669280" cy="1962443"/>
@@ -2573,6 +3606,7 @@
     <w:p>
       <w:r>
         <w:rPr>
+          <w:rFonts w:ascii="Arial" w:hAnsi="Arial"/>
           <w:b/>
         </w:rPr>
         <w:t>Figure A4 — Distribution of every transformed series vs Normal fit.</w:t>
@@ -2583,6 +3617,9 @@
         <w:jc w:val="center"/>
       </w:pPr>
       <w:r>
+        <w:rPr>
+          <w:rFonts w:ascii="Arial" w:hAnsi="Arial"/>
+        </w:rPr>
         <w:drawing>
           <wp:inline xmlns:a="http://schemas.openxmlformats.org/drawingml/2006/main" xmlns:pic="http://schemas.openxmlformats.org/drawingml/2006/picture">
             <wp:extent cx="5669280" cy="3123530"/>
@@ -2620,6 +3657,7 @@
     <w:p>
       <w:r>
         <w:rPr>
+          <w:rFonts w:ascii="Arial" w:hAnsi="Arial"/>
           <w:b/>
         </w:rPr>
         <w:t>Figure A5 — WTI returns: histogram with Normal overlay and Q-Q plot.</w:t>
@@ -2630,6 +3668,9 @@
         <w:jc w:val="center"/>
       </w:pPr>
       <w:r>
+        <w:rPr>
+          <w:rFonts w:ascii="Arial" w:hAnsi="Arial"/>
+        </w:rPr>
         <w:drawing>
           <wp:inline xmlns:a="http://schemas.openxmlformats.org/drawingml/2006/main" xmlns:pic="http://schemas.openxmlformats.org/drawingml/2006/picture">
             <wp:extent cx="5669280" cy="1943753"/>
@@ -3038,7 +4079,7 @@
     <w:qFormat/>
     <w:rsid w:val="00FC693F"/>
     <w:rPr>
-      <w:rFonts w:ascii="Calibri" w:hAnsi="Calibri"/>
+      <w:rFonts w:ascii="Arial" w:hAnsi="Arial"/>
       <w:sz w:val="22"/>
     </w:rPr>
   </w:style>
@@ -3101,7 +4142,7 @@
       <w:outlineLvl w:val="0"/>
     </w:pPr>
     <w:rPr>
-      <w:rFonts w:asciiTheme="majorHAnsi" w:eastAsiaTheme="majorEastAsia" w:hAnsiTheme="majorHAnsi" w:cstheme="majorBidi"/>
+      <w:rFonts w:asciiTheme="majorHAnsi" w:eastAsiaTheme="majorEastAsia" w:hAnsiTheme="majorHAnsi" w:cstheme="majorBidi" w:ascii="Arial" w:hAnsi="Arial"/>
       <w:b/>
       <w:bCs/>
       <w:color w:val="365F91" w:themeColor="accent1" w:themeShade="BF"/>
@@ -3125,7 +4166,7 @@
       <w:outlineLvl w:val="1"/>
     </w:pPr>
     <w:rPr>
-      <w:rFonts w:asciiTheme="majorHAnsi" w:eastAsiaTheme="majorEastAsia" w:hAnsiTheme="majorHAnsi" w:cstheme="majorBidi"/>
+      <w:rFonts w:asciiTheme="majorHAnsi" w:eastAsiaTheme="majorEastAsia" w:hAnsiTheme="majorHAnsi" w:cstheme="majorBidi" w:ascii="Arial" w:hAnsi="Arial"/>
       <w:b/>
       <w:bCs/>
       <w:color w:val="4F81BD" w:themeColor="accent1"/>
@@ -3149,7 +4190,7 @@
       <w:outlineLvl w:val="2"/>
     </w:pPr>
     <w:rPr>
-      <w:rFonts w:asciiTheme="majorHAnsi" w:eastAsiaTheme="majorEastAsia" w:hAnsiTheme="majorHAnsi" w:cstheme="majorBidi"/>
+      <w:rFonts w:asciiTheme="majorHAnsi" w:eastAsiaTheme="majorEastAsia" w:hAnsiTheme="majorHAnsi" w:cstheme="majorBidi" w:ascii="Arial" w:hAnsi="Arial"/>
       <w:b/>
       <w:bCs/>
       <w:color w:val="4F81BD" w:themeColor="accent1"/>
@@ -3172,7 +4213,7 @@
       <w:outlineLvl w:val="3"/>
     </w:pPr>
     <w:rPr>
-      <w:rFonts w:asciiTheme="majorHAnsi" w:eastAsiaTheme="majorEastAsia" w:hAnsiTheme="majorHAnsi" w:cstheme="majorBidi"/>
+      <w:rFonts w:asciiTheme="majorHAnsi" w:eastAsiaTheme="majorEastAsia" w:hAnsiTheme="majorHAnsi" w:cstheme="majorBidi" w:ascii="Arial" w:hAnsi="Arial"/>
       <w:b/>
       <w:bCs/>
       <w:i/>
@@ -3390,7 +4431,7 @@
       <w:contextualSpacing/>
     </w:pPr>
     <w:rPr>
-      <w:rFonts w:asciiTheme="majorHAnsi" w:eastAsiaTheme="majorEastAsia" w:hAnsiTheme="majorHAnsi" w:cstheme="majorBidi"/>
+      <w:rFonts w:asciiTheme="majorHAnsi" w:eastAsiaTheme="majorEastAsia" w:hAnsiTheme="majorHAnsi" w:cstheme="majorBidi" w:ascii="Arial" w:hAnsi="Arial"/>
       <w:color w:val="17365D" w:themeColor="text2" w:themeShade="BF"/>
       <w:spacing w:val="5"/>
       <w:kern w:val="28"/>
@@ -3570,6 +4611,9 @@
       </w:numPr>
       <w:contextualSpacing/>
     </w:pPr>
+    <w:rPr>
+      <w:rFonts w:ascii="Arial" w:hAnsi="Arial"/>
+    </w:rPr>
   </w:style>
   <w:style w:type="paragraph" w:styleId="ListBullet2">
     <w:name w:val="List Bullet 2"/>
@@ -3609,6 +4653,9 @@
       </w:numPr>
       <w:contextualSpacing/>
     </w:pPr>
+    <w:rPr>
+      <w:rFonts w:ascii="Arial" w:hAnsi="Arial"/>
+    </w:rPr>
   </w:style>
   <w:style w:type="paragraph" w:styleId="ListNumber2">
     <w:name w:val="List Number 2"/>
@@ -3877,6 +4924,7 @@
       <w:ind w:left="936" w:right="936"/>
     </w:pPr>
     <w:rPr>
+      <w:rFonts w:ascii="Arial" w:hAnsi="Arial"/>
       <w:b/>
       <w:bCs/>
       <w:i/>

</xml_diff>

<commit_message>
Student A report: drop meta 'Role and scope' section, place figures inline
- Figures A1-A5 now sit at their point of reference in the body with
  captions, instead of an appendix dump
- Sections renumbered 1-5; step numbers kept in parentheses in headings

Co-Authored-By: Claude Fable 5 <noreply@anthropic.com>
Claude-Session: https://claude.ai/code/session_01TXeBuaami2Sc9P1Aii2M7B
</commit_message>
<xml_diff>
--- a/GWP1_StudentA/GWP1_StudentA_Report.docx
+++ b/GWP1_StudentA/GWP1_StudentA_Report.docx
@@ -463,106 +463,7 @@
         <w:rPr>
           <w:rFonts w:ascii="Arial" w:hAnsi="Arial"/>
         </w:rPr>
-        <w:t>2. Role and scope</w:t>
-      </w:r>
-    </w:p>
-    <w:p>
-      <w:r>
-        <w:rPr>
-          <w:rFonts w:ascii="Arial" w:hAnsi="Arial"/>
-        </w:rPr>
-        <w:t>This document covers the four tasks assigned to Student A in the group's</w:t>
-      </w:r>
-    </w:p>
-    <w:p>
-      <w:r>
-        <w:rPr>
-          <w:rFonts w:ascii="Arial" w:hAnsi="Arial"/>
-        </w:rPr>
-        <w:t>crude-oil PGM project. Under Step 3, Student A identifies, imports, structures</w:t>
-      </w:r>
-    </w:p>
-    <w:p>
-      <w:r>
-        <w:rPr>
-          <w:rFonts w:ascii="Arial" w:hAnsi="Arial"/>
-        </w:rPr>
-        <w:t>and graphs the macroeconomic and geopolitical variables. Under Step 5, Student A</w:t>
-      </w:r>
-    </w:p>
-    <w:p>
-      <w:r>
-        <w:rPr>
-          <w:rFonts w:ascii="Arial" w:hAnsi="Arial"/>
-        </w:rPr>
-        <w:t>runs the extreme-outlier part of the cleaning protocol on *all* of the group's</w:t>
-      </w:r>
-    </w:p>
-    <w:p>
-      <w:r>
-        <w:rPr>
-          <w:rFonts w:ascii="Arial" w:hAnsi="Arial"/>
-        </w:rPr>
-        <w:t>series, so that every dataset passes through this lens once. Under Step 7,</w:t>
-      </w:r>
-    </w:p>
-    <w:p>
-      <w:r>
-        <w:rPr>
-          <w:rFonts w:ascii="Arial" w:hAnsi="Arial"/>
-        </w:rPr>
-        <w:t>Student A produces the distributional plots, again for all datasets. Under</w:t>
-      </w:r>
-    </w:p>
-    <w:p>
-      <w:r>
-        <w:rPr>
-          <w:rFonts w:ascii="Arial" w:hAnsi="Arial"/>
-        </w:rPr>
-        <w:t>Step 9, Student A summarises probabilistic graphical models and the distinction</w:t>
-      </w:r>
-    </w:p>
-    <w:p>
-      <w:r>
-        <w:rPr>
-          <w:rFonts w:ascii="Arial" w:hAnsi="Arial"/>
-        </w:rPr>
-        <w:t>between belief networks and Markov networks. The group-level steps — problem</w:t>
-      </w:r>
-    </w:p>
-    <w:p>
-      <w:r>
-        <w:rPr>
-          <w:rFonts w:ascii="Arial" w:hAnsi="Arial"/>
-        </w:rPr>
-        <w:t>formulation, the combined data dictionary, the sterilized dataset, the Step 8</w:t>
-      </w:r>
-    </w:p>
-    <w:p>
-      <w:r>
-        <w:rPr>
-          <w:rFonts w:ascii="Arial" w:hAnsi="Arial"/>
-        </w:rPr>
-        <w:t>answers and the inferred-causality pseudocode — are written jointly and are not</w:t>
-      </w:r>
-    </w:p>
-    <w:p>
-      <w:r>
-        <w:rPr>
-          <w:rFonts w:ascii="Arial" w:hAnsi="Arial"/>
-        </w:rPr>
-        <w:t>repeated here.</w:t>
-      </w:r>
-    </w:p>
-    <w:p>
-      <w:pPr>
-        <w:pStyle w:val="Heading2"/>
-      </w:pPr>
-      <w:r>
-        <w:rPr>
-          <w:rFonts w:ascii="Arial" w:hAnsi="Arial"/>
-        </w:rPr>
-        <w:t>3. Step 3 — Macroeconomic and geopolitical variables</w:t>
+        <w:t>2. Macroeconomic and geopolitical variables (Step 3)</w:t>
       </w:r>
     </w:p>
     <w:p>
@@ -698,6 +599,57 @@
       </w:r>
     </w:p>
     <w:p>
+      <w:pPr>
+        <w:jc w:val="center"/>
+      </w:pPr>
+      <w:r>
+        <w:rPr>
+          <w:rFonts w:ascii="Arial" w:hAnsi="Arial"/>
+        </w:rPr>
+        <w:drawing>
+          <wp:inline xmlns:a="http://schemas.openxmlformats.org/drawingml/2006/main" xmlns:pic="http://schemas.openxmlformats.org/drawingml/2006/picture">
+            <wp:extent cx="5669280" cy="3488788"/>
+            <wp:docPr id="1" name="Picture 1"/>
+            <wp:cNvGraphicFramePr>
+              <a:graphicFrameLocks noChangeAspect="1"/>
+            </wp:cNvGraphicFramePr>
+            <a:graphic>
+              <a:graphicData uri="http://schemas.openxmlformats.org/drawingml/2006/picture">
+                <pic:pic>
+                  <pic:nvPicPr>
+                    <pic:cNvPr id="0" name="figA1_macro_geo_levels.png"/>
+                    <pic:cNvPicPr/>
+                  </pic:nvPicPr>
+                  <pic:blipFill>
+                    <a:blip r:embed="rId9"/>
+                    <a:stretch>
+                      <a:fillRect/>
+                    </a:stretch>
+                  </pic:blipFill>
+                  <pic:spPr>
+                    <a:xfrm>
+                      <a:off x="0" y="0"/>
+                      <a:ext cx="5669280" cy="3488788"/>
+                    </a:xfrm>
+                    <a:prstGeom prst="rect"/>
+                  </pic:spPr>
+                </pic:pic>
+              </a:graphicData>
+            </a:graphic>
+          </wp:inline>
+        </w:drawing>
+      </w:r>
+    </w:p>
+    <w:p>
+      <w:r>
+        <w:rPr>
+          <w:rFonts w:ascii="Arial" w:hAnsi="Arial"/>
+          <w:b/>
+        </w:rPr>
+        <w:t>Figure A1 — Student A variables in levels: broad U.S. dollar index and the GPR index (full history), with major geopolitical events marked.</w:t>
+      </w:r>
+    </w:p>
+    <w:p>
       <w:r>
         <w:rPr>
           <w:rFonts w:ascii="Arial" w:hAnsi="Arial"/>
@@ -718,7 +670,7 @@
         <w:rPr>
           <w:rFonts w:ascii="Arial" w:hAnsi="Arial"/>
         </w:rPr>
-        <w:t>monthly change (Figures A1–A2). Two structuring observations matter for the</w:t>
+        <w:t>monthly change (Figure A2). Two structuring observations matter for the</w:t>
       </w:r>
     </w:p>
     <w:p>
@@ -784,13 +736,64 @@
     </w:p>
     <w:p>
       <w:pPr>
+        <w:jc w:val="center"/>
+      </w:pPr>
+      <w:r>
+        <w:rPr>
+          <w:rFonts w:ascii="Arial" w:hAnsi="Arial"/>
+        </w:rPr>
+        <w:drawing>
+          <wp:inline xmlns:a="http://schemas.openxmlformats.org/drawingml/2006/main" xmlns:pic="http://schemas.openxmlformats.org/drawingml/2006/picture">
+            <wp:extent cx="5669280" cy="3052689"/>
+            <wp:docPr id="2" name="Picture 2"/>
+            <wp:cNvGraphicFramePr>
+              <a:graphicFrameLocks noChangeAspect="1"/>
+            </wp:cNvGraphicFramePr>
+            <a:graphic>
+              <a:graphicData uri="http://schemas.openxmlformats.org/drawingml/2006/picture">
+                <pic:pic>
+                  <pic:nvPicPr>
+                    <pic:cNvPr id="0" name="figA2_macro_geo_changes.png"/>
+                    <pic:cNvPicPr/>
+                  </pic:nvPicPr>
+                  <pic:blipFill>
+                    <a:blip r:embed="rId10"/>
+                    <a:stretch>
+                      <a:fillRect/>
+                    </a:stretch>
+                  </pic:blipFill>
+                  <pic:spPr>
+                    <a:xfrm>
+                      <a:off x="0" y="0"/>
+                      <a:ext cx="5669280" cy="3052689"/>
+                    </a:xfrm>
+                    <a:prstGeom prst="rect"/>
+                  </pic:spPr>
+                </pic:pic>
+              </a:graphicData>
+            </a:graphic>
+          </wp:inline>
+        </w:drawing>
+      </w:r>
+    </w:p>
+    <w:p>
+      <w:r>
+        <w:rPr>
+          <w:rFonts w:ascii="Arial" w:hAnsi="Arial"/>
+          <w:b/>
+        </w:rPr>
+        <w:t>Figure A2 — Structured to the core sample: dollar monthly log-return and GPR monthly change.</w:t>
+      </w:r>
+    </w:p>
+    <w:p>
+      <w:pPr>
         <w:pStyle w:val="Heading2"/>
       </w:pPr>
       <w:r>
         <w:rPr>
           <w:rFonts w:ascii="Arial" w:hAnsi="Arial"/>
         </w:rPr>
-        <w:t>4. Step 5 — Extreme-outlier screening (all series)</w:t>
+        <w:t>3. Extreme-outlier screening on all series (Step 5)</w:t>
       </w:r>
     </w:p>
     <w:p>
@@ -2090,13 +2093,64 @@
     </w:p>
     <w:p>
       <w:pPr>
+        <w:jc w:val="center"/>
+      </w:pPr>
+      <w:r>
+        <w:rPr>
+          <w:rFonts w:ascii="Arial" w:hAnsi="Arial"/>
+        </w:rPr>
+        <w:drawing>
+          <wp:inline xmlns:a="http://schemas.openxmlformats.org/drawingml/2006/main" xmlns:pic="http://schemas.openxmlformats.org/drawingml/2006/picture">
+            <wp:extent cx="5669280" cy="1962443"/>
+            <wp:docPr id="3" name="Picture 3"/>
+            <wp:cNvGraphicFramePr>
+              <a:graphicFrameLocks noChangeAspect="1"/>
+            </wp:cNvGraphicFramePr>
+            <a:graphic>
+              <a:graphicData uri="http://schemas.openxmlformats.org/drawingml/2006/picture">
+                <pic:pic>
+                  <pic:nvPicPr>
+                    <pic:cNvPr id="0" name="figA3_outlier_flags.png"/>
+                    <pic:cNvPicPr/>
+                  </pic:nvPicPr>
+                  <pic:blipFill>
+                    <a:blip r:embed="rId11"/>
+                    <a:stretch>
+                      <a:fillRect/>
+                    </a:stretch>
+                  </pic:blipFill>
+                  <pic:spPr>
+                    <a:xfrm>
+                      <a:off x="0" y="0"/>
+                      <a:ext cx="5669280" cy="1962443"/>
+                    </a:xfrm>
+                    <a:prstGeom prst="rect"/>
+                  </pic:spPr>
+                </pic:pic>
+              </a:graphicData>
+            </a:graphic>
+          </wp:inline>
+        </w:drawing>
+      </w:r>
+    </w:p>
+    <w:p>
+      <w:r>
+        <w:rPr>
+          <w:rFonts w:ascii="Arial" w:hAnsi="Arial"/>
+          <w:b/>
+        </w:rPr>
+        <w:t>Figure A3 — WTI monthly log-returns with the outlier flags. Flagged months are reviewed and kept, not deleted.</w:t>
+      </w:r>
+    </w:p>
+    <w:p>
+      <w:pPr>
         <w:pStyle w:val="Heading2"/>
       </w:pPr>
       <w:r>
         <w:rPr>
           <w:rFonts w:ascii="Arial" w:hAnsi="Arial"/>
         </w:rPr>
-        <w:t>5. Step 7 — Distributional analysis (all datasets)</w:t>
+        <w:t>4. Distributional analysis of all datasets (Step 7)</w:t>
       </w:r>
     </w:p>
     <w:p>
@@ -2129,6 +2183,57 @@
           <w:rFonts w:ascii="Arial" w:hAnsi="Arial"/>
         </w:rPr>
         <w:t>Table A2 collects the moments.</w:t>
+      </w:r>
+    </w:p>
+    <w:p>
+      <w:pPr>
+        <w:jc w:val="center"/>
+      </w:pPr>
+      <w:r>
+        <w:rPr>
+          <w:rFonts w:ascii="Arial" w:hAnsi="Arial"/>
+        </w:rPr>
+        <w:drawing>
+          <wp:inline xmlns:a="http://schemas.openxmlformats.org/drawingml/2006/main" xmlns:pic="http://schemas.openxmlformats.org/drawingml/2006/picture">
+            <wp:extent cx="5669280" cy="3123530"/>
+            <wp:docPr id="4" name="Picture 4"/>
+            <wp:cNvGraphicFramePr>
+              <a:graphicFrameLocks noChangeAspect="1"/>
+            </wp:cNvGraphicFramePr>
+            <a:graphic>
+              <a:graphicData uri="http://schemas.openxmlformats.org/drawingml/2006/picture">
+                <pic:pic>
+                  <pic:nvPicPr>
+                    <pic:cNvPr id="0" name="figA4_distribution_grid.png"/>
+                    <pic:cNvPicPr/>
+                  </pic:nvPicPr>
+                  <pic:blipFill>
+                    <a:blip r:embed="rId12"/>
+                    <a:stretch>
+                      <a:fillRect/>
+                    </a:stretch>
+                  </pic:blipFill>
+                  <pic:spPr>
+                    <a:xfrm>
+                      <a:off x="0" y="0"/>
+                      <a:ext cx="5669280" cy="3123530"/>
+                    </a:xfrm>
+                    <a:prstGeom prst="rect"/>
+                  </pic:spPr>
+                </pic:pic>
+              </a:graphicData>
+            </a:graphic>
+          </wp:inline>
+        </w:drawing>
+      </w:r>
+    </w:p>
+    <w:p>
+      <w:r>
+        <w:rPr>
+          <w:rFonts w:ascii="Arial" w:hAnsi="Arial"/>
+          <w:b/>
+        </w:rPr>
+        <w:t>Figure A4 — Distribution of every transformed series against its Normal fit (skew and excess kurtosis in each title).</w:t>
       </w:r>
     </w:p>
     <w:p>
@@ -2844,7 +2949,66 @@
         <w:rPr>
           <w:rFonts w:ascii="Arial" w:hAnsi="Arial"/>
         </w:rPr>
-        <w:t>bends off the reference line at both ends — the visual signature of fat tails.</w:t>
+        <w:t>(Figure A5) bends off the reference line at both ends — the visual signature of</w:t>
+      </w:r>
+    </w:p>
+    <w:p>
+      <w:r>
+        <w:rPr>
+          <w:rFonts w:ascii="Arial" w:hAnsi="Arial"/>
+        </w:rPr>
+        <w:t>fat tails.</w:t>
+      </w:r>
+    </w:p>
+    <w:p>
+      <w:pPr>
+        <w:jc w:val="center"/>
+      </w:pPr>
+      <w:r>
+        <w:rPr>
+          <w:rFonts w:ascii="Arial" w:hAnsi="Arial"/>
+        </w:rPr>
+        <w:drawing>
+          <wp:inline xmlns:a="http://schemas.openxmlformats.org/drawingml/2006/main" xmlns:pic="http://schemas.openxmlformats.org/drawingml/2006/picture">
+            <wp:extent cx="5669280" cy="1943753"/>
+            <wp:docPr id="5" name="Picture 5"/>
+            <wp:cNvGraphicFramePr>
+              <a:graphicFrameLocks noChangeAspect="1"/>
+            </wp:cNvGraphicFramePr>
+            <a:graphic>
+              <a:graphicData uri="http://schemas.openxmlformats.org/drawingml/2006/picture">
+                <pic:pic>
+                  <pic:nvPicPr>
+                    <pic:cNvPr id="0" name="figA5_wti_distribution.png"/>
+                    <pic:cNvPicPr/>
+                  </pic:nvPicPr>
+                  <pic:blipFill>
+                    <a:blip r:embed="rId13"/>
+                    <a:stretch>
+                      <a:fillRect/>
+                    </a:stretch>
+                  </pic:blipFill>
+                  <pic:spPr>
+                    <a:xfrm>
+                      <a:off x="0" y="0"/>
+                      <a:ext cx="5669280" cy="1943753"/>
+                    </a:xfrm>
+                    <a:prstGeom prst="rect"/>
+                  </pic:spPr>
+                </pic:pic>
+              </a:graphicData>
+            </a:graphic>
+          </wp:inline>
+        </w:drawing>
+      </w:r>
+    </w:p>
+    <w:p>
+      <w:r>
+        <w:rPr>
+          <w:rFonts w:ascii="Arial" w:hAnsi="Arial"/>
+          <w:b/>
+        </w:rPr>
+        <w:t>Figure A5 — WTI monthly log-returns: histogram with Normal overlay (left) and Normal Q-Q plot (right).</w:t>
       </w:r>
     </w:p>
     <w:p>
@@ -2951,7 +3115,7 @@
         <w:rPr>
           <w:rFonts w:ascii="Arial" w:hAnsi="Arial"/>
         </w:rPr>
-        <w:t>6. Step 9 — Probabilistic graphical models: belief networks and Markov networks</w:t>
+        <w:t>5. Probabilistic graphical models: belief networks and Markov networks (Step 9)</w:t>
       </w:r>
     </w:p>
     <w:p>
@@ -3428,283 +3592,6 @@
         <w:t>www.eia.gov/petroleum/data.php.</w:t>
       </w:r>
     </w:p>
-    <w:p>
-      <w:pPr>
-        <w:jc w:val="center"/>
-      </w:pPr>
-      <w:r>
-        <w:rPr>
-          <w:rFonts w:ascii="Arial" w:hAnsi="Arial"/>
-        </w:rPr>
-        <w:t>____________________________________________________________</w:t>
-      </w:r>
-    </w:p>
-    <w:p>
-      <w:pPr>
-        <w:pStyle w:val="Heading2"/>
-      </w:pPr>
-      <w:r>
-        <w:rPr>
-          <w:rFonts w:ascii="Arial" w:hAnsi="Arial"/>
-        </w:rPr>
-        <w:t>Appendix — Figures</w:t>
-      </w:r>
-    </w:p>
-    <w:p>
-      <w:r>
-        <w:rPr>
-          <w:rFonts w:ascii="Arial" w:hAnsi="Arial"/>
-          <w:b/>
-        </w:rPr>
-        <w:t>Figure A1 — Student A variables in levels: dollar index and GPR (full history).</w:t>
-      </w:r>
-    </w:p>
-    <w:p>
-      <w:pPr>
-        <w:jc w:val="center"/>
-      </w:pPr>
-      <w:r>
-        <w:rPr>
-          <w:rFonts w:ascii="Arial" w:hAnsi="Arial"/>
-        </w:rPr>
-        <w:drawing>
-          <wp:inline xmlns:a="http://schemas.openxmlformats.org/drawingml/2006/main" xmlns:pic="http://schemas.openxmlformats.org/drawingml/2006/picture">
-            <wp:extent cx="5669280" cy="3488788"/>
-            <wp:docPr id="1" name="Picture 1"/>
-            <wp:cNvGraphicFramePr>
-              <a:graphicFrameLocks noChangeAspect="1"/>
-            </wp:cNvGraphicFramePr>
-            <a:graphic>
-              <a:graphicData uri="http://schemas.openxmlformats.org/drawingml/2006/picture">
-                <pic:pic>
-                  <pic:nvPicPr>
-                    <pic:cNvPr id="0" name="figA1_macro_geo_levels.png"/>
-                    <pic:cNvPicPr/>
-                  </pic:nvPicPr>
-                  <pic:blipFill>
-                    <a:blip r:embed="rId9"/>
-                    <a:stretch>
-                      <a:fillRect/>
-                    </a:stretch>
-                  </pic:blipFill>
-                  <pic:spPr>
-                    <a:xfrm>
-                      <a:off x="0" y="0"/>
-                      <a:ext cx="5669280" cy="3488788"/>
-                    </a:xfrm>
-                    <a:prstGeom prst="rect"/>
-                  </pic:spPr>
-                </pic:pic>
-              </a:graphicData>
-            </a:graphic>
-          </wp:inline>
-        </w:drawing>
-      </w:r>
-    </w:p>
-    <w:p>
-      <w:r>
-        <w:rPr>
-          <w:rFonts w:ascii="Arial" w:hAnsi="Arial"/>
-          <w:b/>
-        </w:rPr>
-        <w:t>Figure A2 — Structured to the core sample: dollar monthly return and GPR monthly change.</w:t>
-      </w:r>
-    </w:p>
-    <w:p>
-      <w:pPr>
-        <w:jc w:val="center"/>
-      </w:pPr>
-      <w:r>
-        <w:rPr>
-          <w:rFonts w:ascii="Arial" w:hAnsi="Arial"/>
-        </w:rPr>
-        <w:drawing>
-          <wp:inline xmlns:a="http://schemas.openxmlformats.org/drawingml/2006/main" xmlns:pic="http://schemas.openxmlformats.org/drawingml/2006/picture">
-            <wp:extent cx="5669280" cy="3052689"/>
-            <wp:docPr id="2" name="Picture 2"/>
-            <wp:cNvGraphicFramePr>
-              <a:graphicFrameLocks noChangeAspect="1"/>
-            </wp:cNvGraphicFramePr>
-            <a:graphic>
-              <a:graphicData uri="http://schemas.openxmlformats.org/drawingml/2006/picture">
-                <pic:pic>
-                  <pic:nvPicPr>
-                    <pic:cNvPr id="0" name="figA2_macro_geo_changes.png"/>
-                    <pic:cNvPicPr/>
-                  </pic:nvPicPr>
-                  <pic:blipFill>
-                    <a:blip r:embed="rId10"/>
-                    <a:stretch>
-                      <a:fillRect/>
-                    </a:stretch>
-                  </pic:blipFill>
-                  <pic:spPr>
-                    <a:xfrm>
-                      <a:off x="0" y="0"/>
-                      <a:ext cx="5669280" cy="3052689"/>
-                    </a:xfrm>
-                    <a:prstGeom prst="rect"/>
-                  </pic:spPr>
-                </pic:pic>
-              </a:graphicData>
-            </a:graphic>
-          </wp:inline>
-        </w:drawing>
-      </w:r>
-    </w:p>
-    <w:p>
-      <w:r>
-        <w:rPr>
-          <w:rFonts w:ascii="Arial" w:hAnsi="Arial"/>
-          <w:b/>
-        </w:rPr>
-        <w:t>Figure A3 — Outlier flags on WTI monthly returns (flagged, kept).</w:t>
-      </w:r>
-    </w:p>
-    <w:p>
-      <w:pPr>
-        <w:jc w:val="center"/>
-      </w:pPr>
-      <w:r>
-        <w:rPr>
-          <w:rFonts w:ascii="Arial" w:hAnsi="Arial"/>
-        </w:rPr>
-        <w:drawing>
-          <wp:inline xmlns:a="http://schemas.openxmlformats.org/drawingml/2006/main" xmlns:pic="http://schemas.openxmlformats.org/drawingml/2006/picture">
-            <wp:extent cx="5669280" cy="1962443"/>
-            <wp:docPr id="3" name="Picture 3"/>
-            <wp:cNvGraphicFramePr>
-              <a:graphicFrameLocks noChangeAspect="1"/>
-            </wp:cNvGraphicFramePr>
-            <a:graphic>
-              <a:graphicData uri="http://schemas.openxmlformats.org/drawingml/2006/picture">
-                <pic:pic>
-                  <pic:nvPicPr>
-                    <pic:cNvPr id="0" name="figA3_outlier_flags.png"/>
-                    <pic:cNvPicPr/>
-                  </pic:nvPicPr>
-                  <pic:blipFill>
-                    <a:blip r:embed="rId11"/>
-                    <a:stretch>
-                      <a:fillRect/>
-                    </a:stretch>
-                  </pic:blipFill>
-                  <pic:spPr>
-                    <a:xfrm>
-                      <a:off x="0" y="0"/>
-                      <a:ext cx="5669280" cy="1962443"/>
-                    </a:xfrm>
-                    <a:prstGeom prst="rect"/>
-                  </pic:spPr>
-                </pic:pic>
-              </a:graphicData>
-            </a:graphic>
-          </wp:inline>
-        </w:drawing>
-      </w:r>
-    </w:p>
-    <w:p>
-      <w:r>
-        <w:rPr>
-          <w:rFonts w:ascii="Arial" w:hAnsi="Arial"/>
-          <w:b/>
-        </w:rPr>
-        <w:t>Figure A4 — Distribution of every transformed series vs Normal fit.</w:t>
-      </w:r>
-    </w:p>
-    <w:p>
-      <w:pPr>
-        <w:jc w:val="center"/>
-      </w:pPr>
-      <w:r>
-        <w:rPr>
-          <w:rFonts w:ascii="Arial" w:hAnsi="Arial"/>
-        </w:rPr>
-        <w:drawing>
-          <wp:inline xmlns:a="http://schemas.openxmlformats.org/drawingml/2006/main" xmlns:pic="http://schemas.openxmlformats.org/drawingml/2006/picture">
-            <wp:extent cx="5669280" cy="3123530"/>
-            <wp:docPr id="4" name="Picture 4"/>
-            <wp:cNvGraphicFramePr>
-              <a:graphicFrameLocks noChangeAspect="1"/>
-            </wp:cNvGraphicFramePr>
-            <a:graphic>
-              <a:graphicData uri="http://schemas.openxmlformats.org/drawingml/2006/picture">
-                <pic:pic>
-                  <pic:nvPicPr>
-                    <pic:cNvPr id="0" name="figA4_distribution_grid.png"/>
-                    <pic:cNvPicPr/>
-                  </pic:nvPicPr>
-                  <pic:blipFill>
-                    <a:blip r:embed="rId12"/>
-                    <a:stretch>
-                      <a:fillRect/>
-                    </a:stretch>
-                  </pic:blipFill>
-                  <pic:spPr>
-                    <a:xfrm>
-                      <a:off x="0" y="0"/>
-                      <a:ext cx="5669280" cy="3123530"/>
-                    </a:xfrm>
-                    <a:prstGeom prst="rect"/>
-                  </pic:spPr>
-                </pic:pic>
-              </a:graphicData>
-            </a:graphic>
-          </wp:inline>
-        </w:drawing>
-      </w:r>
-    </w:p>
-    <w:p>
-      <w:r>
-        <w:rPr>
-          <w:rFonts w:ascii="Arial" w:hAnsi="Arial"/>
-          <w:b/>
-        </w:rPr>
-        <w:t>Figure A5 — WTI returns: histogram with Normal overlay and Q-Q plot.</w:t>
-      </w:r>
-    </w:p>
-    <w:p>
-      <w:pPr>
-        <w:jc w:val="center"/>
-      </w:pPr>
-      <w:r>
-        <w:rPr>
-          <w:rFonts w:ascii="Arial" w:hAnsi="Arial"/>
-        </w:rPr>
-        <w:drawing>
-          <wp:inline xmlns:a="http://schemas.openxmlformats.org/drawingml/2006/main" xmlns:pic="http://schemas.openxmlformats.org/drawingml/2006/picture">
-            <wp:extent cx="5669280" cy="1943753"/>
-            <wp:docPr id="5" name="Picture 5"/>
-            <wp:cNvGraphicFramePr>
-              <a:graphicFrameLocks noChangeAspect="1"/>
-            </wp:cNvGraphicFramePr>
-            <a:graphic>
-              <a:graphicData uri="http://schemas.openxmlformats.org/drawingml/2006/picture">
-                <pic:pic>
-                  <pic:nvPicPr>
-                    <pic:cNvPr id="0" name="figA5_wti_distribution.png"/>
-                    <pic:cNvPicPr/>
-                  </pic:nvPicPr>
-                  <pic:blipFill>
-                    <a:blip r:embed="rId13"/>
-                    <a:stretch>
-                      <a:fillRect/>
-                    </a:stretch>
-                  </pic:blipFill>
-                  <pic:spPr>
-                    <a:xfrm>
-                      <a:off x="0" y="0"/>
-                      <a:ext cx="5669280" cy="1943753"/>
-                    </a:xfrm>
-                    <a:prstGeom prst="rect"/>
-                  </pic:spPr>
-                </pic:pic>
-              </a:graphicData>
-            </a:graphic>
-          </wp:inline>
-        </w:drawing>
-      </w:r>
-    </w:p>
     <w:sectPr>
       <w:pgSz w:w="12240" w:h="15840"/>
       <w:pgMar w:top="1440" w:right="1800" w:bottom="1440" w:left="1800" w:header="720" w:footer="720" w:gutter="0"/>

</xml_diff>